<commit_message>
Fill in individual contributions
</commit_message>
<xml_diff>
--- a/design/Trust-No-Wall-Descriptive-Document.docx
+++ b/design/Trust-No-Wall-Descriptive-Document.docx
@@ -2478,7 +2478,7 @@
         <w:t xml:space="preserve">Qiming Xiao: </w:t>
       </w:r>
       <w:r>
-        <w:t>[Add your main contributions here]</w:t>
+        <w:t>Game concept and design direction (maze + deceptive-maze twist), genre research on Pac-Man, Maze Craze and Level Devil, design of the obstacle set and level progression (which mechanic unlocks when), playtesting and difficulty feedback, the descriptive document, and the gameplay video.</w:t>
       </w:r>
     </w:p>
     <w:p>
@@ -2492,7 +2492,7 @@
         <w:t xml:space="preserve">Manas Vardhan: </w:t>
       </w:r>
       <w:r>
-        <w:t>[Add your main contributions here]</w:t>
+        <w:t>Unity implementation: procedural maze generation and the solvability validator, the level simulation for all obstacles, rendering, animations, HUD, audio and game flow, the demo autopilot and automated tests, and the WebGL build hosted on GitHub Pages.</w:t>
       </w:r>
     </w:p>
     <w:p>

</xml_diff>

<commit_message>
Tighten descriptive document to the rubric
One-sentence logline in (Genre + Twist) form, a 3-sentence prototype
description, a single-row Twist and Mechanics Matrix for the core
mechanic, and a trimmed document (about 950 words, down from 2400).
The docx and Discord post logline match.
</commit_message>
<xml_diff>
--- a/design/Trust-No-Wall-Descriptive-Document.docx
+++ b/design/Trust-No-Wall-Descriptive-Document.docx
@@ -72,7 +72,7 @@
     </w:p>
     <w:p>
       <w:r>
-        <w:t>A 2D top-down maze game where the maze itself lies to you: walls hide, slide, vanish and rewire as you move, but every lie follows a learnable rule and every maze is guaranteed to be solvable. (Maze + A Deceptive, Changing Maze)</w:t>
+        <w:t>A 2D top-down maze game where the maze itself lies to you: walls hide, move, vanish and rewire, but every lie follows a learnable rule (Maze + Deceptive, Changing Maze).</w:t>
       </w:r>
     </w:p>
     <w:p>
@@ -280,7 +280,7 @@
     </w:p>
     <w:p>
       <w:r>
-        <w:t>The player controls a small blob in a 2D top-down maze and must walk from the Start pad (green ring) to the Destination (gold star). The game starts with a 4 x 4 maze on Level 1, and each new level grows the maze by one in each dimension (Maze Size = (Level + 3) x (Level + 3)). New obstacles are introduced gradually with an intro card: invisible walls and memory tiles (level 2), moving and disappearing walls (3), collapsing tiles and trigger walls (4), teleporters and rotating gates (5), patrols and one-way paths (6), a decoy destination (7) and a shadow that chases the player's trail (8). From level 9 the game combines four or five random mechanics per level. Touching a fatal obstacle plays a short failure effect and restarts the same layout from the Start; reaching the Destination shows a completion banner and generates the next, larger maze. A demo mode (add ?demo=1 to the URL, or press F2) lets an autopilot play the game.</w:t>
+        <w:t>The player steps through a top-down grid maze from a Start pad to a Destination star, and the maze grows by one cell in each dimension every level (4 x 4 on level 1). As levels progress, new obstacles that deceive or change the maze unlock: invisible walls, sliding and disappearing walls, collapsing floors, trigger plates that rewire walls, teleporters, rotating gates, patrols, one-way paths, a decoy goal and a shadow that follows the player's trail. Because each obstacle follows a fixed rule and dying restarts the same layout, the player must observe, time and remember the maze's tricks instead of simply reading its map.</w:t>
       </w:r>
     </w:p>
     <w:p>
@@ -529,7 +529,7 @@
         <w:pStyle w:val="Heading1"/>
       </w:pPr>
       <w:r>
-        <w:t>Mechanic Matrices: Twist and Mechanics Matrix</w:t>
+        <w:t>Mechanic Matrices: Twist and Mechanics Matrix (core mechanic)</w:t>
       </w:r>
     </w:p>
     <w:tbl>
@@ -558,7 +558,7 @@
             <w:r>
               <w:rPr>
                 <w:b/>
-                <w:sz w:val="16"/>
+                <w:sz w:val="18"/>
               </w:rPr>
               <w:t>Mechanics</w:t>
             </w:r>
@@ -574,7 +574,7 @@
             <w:r>
               <w:rPr>
                 <w:b/>
-                <w:sz w:val="16"/>
+                <w:sz w:val="18"/>
               </w:rPr>
               <w:t>Description</w:t>
             </w:r>
@@ -590,7 +590,7 @@
             <w:r>
               <w:rPr>
                 <w:b/>
-                <w:sz w:val="16"/>
+                <w:sz w:val="18"/>
               </w:rPr>
               <w:t>Interaction with Twist</w:t>
             </w:r>
@@ -606,7 +606,7 @@
             <w:r>
               <w:rPr>
                 <w:b/>
-                <w:sz w:val="16"/>
+                <w:sz w:val="18"/>
               </w:rPr>
               <w:t>Affected Genre Elements</w:t>
             </w:r>
@@ -622,7 +622,7 @@
             <w:r>
               <w:rPr>
                 <w:b/>
-                <w:sz w:val="16"/>
+                <w:sz w:val="18"/>
               </w:rPr>
               <w:t>Type of Genre Innovation</w:t>
             </w:r>
@@ -638,7 +638,7 @@
             <w:r>
               <w:rPr>
                 <w:b/>
-                <w:sz w:val="16"/>
+                <w:sz w:val="18"/>
               </w:rPr>
               <w:t>Supports</w:t>
             </w:r>
@@ -655,7 +655,7 @@
             <w:r>
               <w:rPr>
                 <w:b/>
-                <w:sz w:val="16"/>
+                <w:sz w:val="18"/>
               </w:rPr>
               <w:t>Deceptive, Changing Maze (Core Mechanic)</w:t>
             </w:r>
@@ -669,7 +669,7 @@
             <w:r/>
             <w:r>
               <w:rPr>
-                <w:sz w:val="16"/>
+                <w:sz w:val="18"/>
               </w:rPr>
               <w:t>The maze's walls and floor hide, move, vanish and rewire according to fixed rules while the player navigates it.</w:t>
             </w:r>
@@ -683,7 +683,7 @@
             <w:r/>
             <w:r>
               <w:rPr>
-                <w:sz w:val="16"/>
+                <w:sz w:val="18"/>
               </w:rPr>
               <w:t>This is the twist: the player cannot trust what they see and must learn each rule instead of just reading the map.</w:t>
             </w:r>
@@ -697,7 +697,7 @@
             <w:r/>
             <w:r>
               <w:rPr>
-                <w:sz w:val="16"/>
+                <w:sz w:val="18"/>
               </w:rPr>
               <w:t>Maze layout, walls, navigation, goal</w:t>
             </w:r>
@@ -711,7 +711,7 @@
             <w:r/>
             <w:r>
               <w:rPr>
-                <w:sz w:val="16"/>
+                <w:sz w:val="18"/>
               </w:rPr>
               <w:t>Subversion, Combination</w:t>
             </w:r>
@@ -725,1227 +725,9 @@
             <w:r/>
             <w:r>
               <w:rPr>
-                <w:sz w:val="16"/>
+                <w:sz w:val="18"/>
               </w:rPr>
               <w:t>Deception; learnable rules</w:t>
-            </w:r>
-          </w:p>
-        </w:tc>
-      </w:tr>
-      <w:tr>
-        <w:tc>
-          <w:tcPr>
-            <w:tcW w:type="dxa" w:w="1584"/>
-          </w:tcPr>
-          <w:p>
-            <w:r/>
-            <w:r>
-              <w:rPr>
-                <w:b/>
-                <w:sz w:val="16"/>
-              </w:rPr>
-              <w:t>Invisible Walls</w:t>
-            </w:r>
-          </w:p>
-        </w:tc>
-        <w:tc>
-          <w:tcPr>
-            <w:tcW w:type="dxa" w:w="2304"/>
-          </w:tcPr>
-          <w:p>
-            <w:r/>
-            <w:r>
-              <w:rPr>
-                <w:sz w:val="16"/>
-              </w:rPr>
-              <w:t>Some walls are not drawn. Walking into one is fatal.</w:t>
-            </w:r>
-          </w:p>
-        </w:tc>
-        <w:tc>
-          <w:tcPr>
-            <w:tcW w:type="dxa" w:w="2304"/>
-          </w:tcPr>
-          <w:p>
-            <w:r/>
-            <w:r>
-              <w:rPr>
-                <w:sz w:val="16"/>
-              </w:rPr>
-              <w:t>The maze literally lies: the visible map omits real walls.</w:t>
-            </w:r>
-          </w:p>
-        </w:tc>
-        <w:tc>
-          <w:tcPr>
-            <w:tcW w:type="dxa" w:w="1296"/>
-          </w:tcPr>
-          <w:p>
-            <w:r/>
-            <w:r>
-              <w:rPr>
-                <w:sz w:val="16"/>
-              </w:rPr>
-              <w:t>Wall visibility, collision</w:t>
-            </w:r>
-          </w:p>
-        </w:tc>
-        <w:tc>
-          <w:tcPr>
-            <w:tcW w:type="dxa" w:w="1152"/>
-          </w:tcPr>
-          <w:p>
-            <w:r/>
-            <w:r>
-              <w:rPr>
-                <w:sz w:val="16"/>
-              </w:rPr>
-              <w:t>Subversion</w:t>
-            </w:r>
-          </w:p>
-        </w:tc>
-        <w:tc>
-          <w:tcPr>
-            <w:tcW w:type="dxa" w:w="1152"/>
-          </w:tcPr>
-          <w:p>
-            <w:r/>
-            <w:r>
-              <w:rPr>
-                <w:sz w:val="16"/>
-              </w:rPr>
-              <w:t>Deception; memory</w:t>
-            </w:r>
-          </w:p>
-        </w:tc>
-      </w:tr>
-      <w:tr>
-        <w:tc>
-          <w:tcPr>
-            <w:tcW w:type="dxa" w:w="1584"/>
-          </w:tcPr>
-          <w:p>
-            <w:r/>
-            <w:r>
-              <w:rPr>
-                <w:b/>
-                <w:sz w:val="16"/>
-              </w:rPr>
-              <w:t>Memory Tiles</w:t>
-            </w:r>
-          </w:p>
-        </w:tc>
-        <w:tc>
-          <w:tcPr>
-            <w:tcW w:type="dxa" w:w="2304"/>
-          </w:tcPr>
-          <w:p>
-            <w:r/>
-            <w:r>
-              <w:rPr>
-                <w:sz w:val="16"/>
-              </w:rPr>
-              <w:t>Stepping on a blue tile reveals the hidden walls within 3 cells for 3 seconds. Every invisible wall is within reach of a memory tile.</w:t>
-            </w:r>
-          </w:p>
-        </w:tc>
-        <w:tc>
-          <w:tcPr>
-            <w:tcW w:type="dxa" w:w="2304"/>
-          </w:tcPr>
-          <w:p>
-            <w:r/>
-            <w:r>
-              <w:rPr>
-                <w:sz w:val="16"/>
-              </w:rPr>
-              <w:t>Keeps the central lie fair: hidden walls can always be learned without dying.</w:t>
-            </w:r>
-          </w:p>
-        </w:tc>
-        <w:tc>
-          <w:tcPr>
-            <w:tcW w:type="dxa" w:w="1296"/>
-          </w:tcPr>
-          <w:p>
-            <w:r/>
-            <w:r>
-              <w:rPr>
-                <w:sz w:val="16"/>
-              </w:rPr>
-              <w:t>Information, exploration</w:t>
-            </w:r>
-          </w:p>
-        </w:tc>
-        <w:tc>
-          <w:tcPr>
-            <w:tcW w:type="dxa" w:w="1152"/>
-          </w:tcPr>
-          <w:p>
-            <w:r/>
-            <w:r>
-              <w:rPr>
-                <w:sz w:val="16"/>
-              </w:rPr>
-              <w:t>Combination</w:t>
-            </w:r>
-          </w:p>
-        </w:tc>
-        <w:tc>
-          <w:tcPr>
-            <w:tcW w:type="dxa" w:w="1152"/>
-          </w:tcPr>
-          <w:p>
-            <w:r/>
-            <w:r>
-              <w:rPr>
-                <w:sz w:val="16"/>
-              </w:rPr>
-              <w:t>Fairness; memory</w:t>
-            </w:r>
-          </w:p>
-        </w:tc>
-      </w:tr>
-      <w:tr>
-        <w:tc>
-          <w:tcPr>
-            <w:tcW w:type="dxa" w:w="1584"/>
-          </w:tcPr>
-          <w:p>
-            <w:r/>
-            <w:r>
-              <w:rPr>
-                <w:b/>
-                <w:sz w:val="16"/>
-              </w:rPr>
-              <w:t>Moving Walls</w:t>
-            </w:r>
-          </w:p>
-        </w:tc>
-        <w:tc>
-          <w:tcPr>
-            <w:tcW w:type="dxa" w:w="2304"/>
-          </w:tcPr>
-          <w:p>
-            <w:r/>
-            <w:r>
-              <w:rPr>
-                <w:sz w:val="16"/>
-              </w:rPr>
-              <w:t>Orange walls slide like a sliding door between two slots every few seconds, with a ghost outline, a track and a flash with an arrow before sliding.</w:t>
-            </w:r>
-          </w:p>
-        </w:tc>
-        <w:tc>
-          <w:tcPr>
-            <w:tcW w:type="dxa" w:w="2304"/>
-          </w:tcPr>
-          <w:p>
-            <w:r/>
-            <w:r>
-              <w:rPr>
-                <w:sz w:val="16"/>
-              </w:rPr>
-              <w:t>A path that was open can become blocked; mistimed crossings crush the player.</w:t>
-            </w:r>
-          </w:p>
-        </w:tc>
-        <w:tc>
-          <w:tcPr>
-            <w:tcW w:type="dxa" w:w="1296"/>
-          </w:tcPr>
-          <w:p>
-            <w:r/>
-            <w:r>
-              <w:rPr>
-                <w:sz w:val="16"/>
-              </w:rPr>
-              <w:t>Static corridors, timing</w:t>
-            </w:r>
-          </w:p>
-        </w:tc>
-        <w:tc>
-          <w:tcPr>
-            <w:tcW w:type="dxa" w:w="1152"/>
-          </w:tcPr>
-          <w:p>
-            <w:r/>
-            <w:r>
-              <w:rPr>
-                <w:sz w:val="16"/>
-              </w:rPr>
-              <w:t>Extension</w:t>
-            </w:r>
-          </w:p>
-        </w:tc>
-        <w:tc>
-          <w:tcPr>
-            <w:tcW w:type="dxa" w:w="1152"/>
-          </w:tcPr>
-          <w:p>
-            <w:r/>
-            <w:r>
-              <w:rPr>
-                <w:sz w:val="16"/>
-              </w:rPr>
-              <w:t>Reactivity; learnable rules</w:t>
-            </w:r>
-          </w:p>
-        </w:tc>
-      </w:tr>
-      <w:tr>
-        <w:tc>
-          <w:tcPr>
-            <w:tcW w:type="dxa" w:w="1584"/>
-          </w:tcPr>
-          <w:p>
-            <w:r/>
-            <w:r>
-              <w:rPr>
-                <w:b/>
-                <w:sz w:val="16"/>
-              </w:rPr>
-              <w:t>Disappearing Walls</w:t>
-            </w:r>
-          </w:p>
-        </w:tc>
-        <w:tc>
-          <w:tcPr>
-            <w:tcW w:type="dxa" w:w="2304"/>
-          </w:tcPr>
-          <w:p>
-            <w:r/>
-            <w:r>
-              <w:rPr>
-                <w:sz w:val="16"/>
-              </w:rPr>
-              <w:t>Cyan walls are solid for 3 s and gone for 2 s, flickering before they return.</w:t>
-            </w:r>
-          </w:p>
-        </w:tc>
-        <w:tc>
-          <w:tcPr>
-            <w:tcW w:type="dxa" w:w="2304"/>
-          </w:tcPr>
-          <w:p>
-            <w:r/>
-            <w:r>
-              <w:rPr>
-                <w:sz w:val="16"/>
-              </w:rPr>
-              <w:t>A wall is not permanent and a gap is not safe; the player must time the crossing.</w:t>
-            </w:r>
-          </w:p>
-        </w:tc>
-        <w:tc>
-          <w:tcPr>
-            <w:tcW w:type="dxa" w:w="1296"/>
-          </w:tcPr>
-          <w:p>
-            <w:r/>
-            <w:r>
-              <w:rPr>
-                <w:sz w:val="16"/>
-              </w:rPr>
-              <w:t>Wall permanence, shortcuts</w:t>
-            </w:r>
-          </w:p>
-        </w:tc>
-        <w:tc>
-          <w:tcPr>
-            <w:tcW w:type="dxa" w:w="1152"/>
-          </w:tcPr>
-          <w:p>
-            <w:r/>
-            <w:r>
-              <w:rPr>
-                <w:sz w:val="16"/>
-              </w:rPr>
-              <w:t>Subversion</w:t>
-            </w:r>
-          </w:p>
-        </w:tc>
-        <w:tc>
-          <w:tcPr>
-            <w:tcW w:type="dxa" w:w="1152"/>
-          </w:tcPr>
-          <w:p>
-            <w:r/>
-            <w:r>
-              <w:rPr>
-                <w:sz w:val="16"/>
-              </w:rPr>
-              <w:t>Reactivity</w:t>
-            </w:r>
-          </w:p>
-        </w:tc>
-      </w:tr>
-      <w:tr>
-        <w:tc>
-          <w:tcPr>
-            <w:tcW w:type="dxa" w:w="1584"/>
-          </w:tcPr>
-          <w:p>
-            <w:r/>
-            <w:r>
-              <w:rPr>
-                <w:b/>
-                <w:sz w:val="16"/>
-              </w:rPr>
-              <w:t>Collapsing Tiles</w:t>
-            </w:r>
-          </w:p>
-        </w:tc>
-        <w:tc>
-          <w:tcPr>
-            <w:tcW w:type="dxa" w:w="2304"/>
-          </w:tcPr>
-          <w:p>
-            <w:r/>
-            <w:r>
-              <w:rPr>
-                <w:sz w:val="16"/>
-              </w:rPr>
-              <w:t>Cracked tiles collapse 0.8 s after being stepped on; some restore, some stay as pits.</w:t>
-            </w:r>
-          </w:p>
-        </w:tc>
-        <w:tc>
-          <w:tcPr>
-            <w:tcW w:type="dxa" w:w="2304"/>
-          </w:tcPr>
-          <w:p>
-            <w:r/>
-            <w:r>
-              <w:rPr>
-                <w:sz w:val="16"/>
-              </w:rPr>
-              <w:t>Even the floor cannot be trusted; the player must keep moving.</w:t>
-            </w:r>
-          </w:p>
-        </w:tc>
-        <w:tc>
-          <w:tcPr>
-            <w:tcW w:type="dxa" w:w="1296"/>
-          </w:tcPr>
-          <w:p>
-            <w:r/>
-            <w:r>
-              <w:rPr>
-                <w:sz w:val="16"/>
-              </w:rPr>
-              <w:t>Floor/ground trust</w:t>
-            </w:r>
-          </w:p>
-        </w:tc>
-        <w:tc>
-          <w:tcPr>
-            <w:tcW w:type="dxa" w:w="1152"/>
-          </w:tcPr>
-          <w:p>
-            <w:r/>
-            <w:r>
-              <w:rPr>
-                <w:sz w:val="16"/>
-              </w:rPr>
-              <w:t>Combination</w:t>
-            </w:r>
-          </w:p>
-        </w:tc>
-        <w:tc>
-          <w:tcPr>
-            <w:tcW w:type="dxa" w:w="1152"/>
-          </w:tcPr>
-          <w:p>
-            <w:r/>
-            <w:r>
-              <w:rPr>
-                <w:sz w:val="16"/>
-              </w:rPr>
-              <w:t>Reactivity; pressure</w:t>
-            </w:r>
-          </w:p>
-        </w:tc>
-      </w:tr>
-      <w:tr>
-        <w:tc>
-          <w:tcPr>
-            <w:tcW w:type="dxa" w:w="1584"/>
-          </w:tcPr>
-          <w:p>
-            <w:r/>
-            <w:r>
-              <w:rPr>
-                <w:b/>
-                <w:sz w:val="16"/>
-              </w:rPr>
-              <w:t>Trigger Walls</w:t>
-            </w:r>
-          </w:p>
-        </w:tc>
-        <w:tc>
-          <w:tcPr>
-            <w:tcW w:type="dxa" w:w="2304"/>
-          </w:tcPr>
-          <w:p>
-            <w:r/>
-            <w:r>
-              <w:rPr>
-                <w:sz w:val="16"/>
-              </w:rPr>
-              <w:t>Pressure plates open and close the walls of their color each time the player steps on them.</w:t>
-            </w:r>
-          </w:p>
-        </w:tc>
-        <w:tc>
-          <w:tcPr>
-            <w:tcW w:type="dxa" w:w="2304"/>
-          </w:tcPr>
-          <w:p>
-            <w:r/>
-            <w:r>
-              <w:rPr>
-                <w:sz w:val="16"/>
-              </w:rPr>
-              <w:t>The player's own movement rewires the maze, opening hidden corridors and closing others.</w:t>
-            </w:r>
-          </w:p>
-        </w:tc>
-        <w:tc>
-          <w:tcPr>
-            <w:tcW w:type="dxa" w:w="1296"/>
-          </w:tcPr>
-          <w:p>
-            <w:r/>
-            <w:r>
-              <w:rPr>
-                <w:sz w:val="16"/>
-              </w:rPr>
-              <w:t>Level topology, cause and effect</w:t>
-            </w:r>
-          </w:p>
-        </w:tc>
-        <w:tc>
-          <w:tcPr>
-            <w:tcW w:type="dxa" w:w="1152"/>
-          </w:tcPr>
-          <w:p>
-            <w:r/>
-            <w:r>
-              <w:rPr>
-                <w:sz w:val="16"/>
-              </w:rPr>
-              <w:t>Combination</w:t>
-            </w:r>
-          </w:p>
-        </w:tc>
-        <w:tc>
-          <w:tcPr>
-            <w:tcW w:type="dxa" w:w="1152"/>
-          </w:tcPr>
-          <w:p>
-            <w:r/>
-            <w:r>
-              <w:rPr>
-                <w:sz w:val="16"/>
-              </w:rPr>
-              <w:t>Reactivity; learnable rules</w:t>
-            </w:r>
-          </w:p>
-        </w:tc>
-      </w:tr>
-      <w:tr>
-        <w:tc>
-          <w:tcPr>
-            <w:tcW w:type="dxa" w:w="1584"/>
-          </w:tcPr>
-          <w:p>
-            <w:r/>
-            <w:r>
-              <w:rPr>
-                <w:b/>
-                <w:sz w:val="16"/>
-              </w:rPr>
-              <w:t>Teleport Tiles</w:t>
-            </w:r>
-          </w:p>
-        </w:tc>
-        <w:tc>
-          <w:tcPr>
-            <w:tcW w:type="dxa" w:w="2304"/>
-          </w:tcPr>
-          <w:p>
-            <w:r/>
-            <w:r>
-              <w:rPr>
-                <w:sz w:val="16"/>
-              </w:rPr>
-              <w:t>Purple pads teleport the player to a marked target, sometimes closer and sometimes farther from the goal.</w:t>
-            </w:r>
-          </w:p>
-        </w:tc>
-        <w:tc>
-          <w:tcPr>
-            <w:tcW w:type="dxa" w:w="2304"/>
-          </w:tcPr>
-          <w:p>
-            <w:r/>
-            <w:r>
-              <w:rPr>
-                <w:sz w:val="16"/>
-              </w:rPr>
-              <w:t>A shortcut can set you back as easily as help you.</w:t>
-            </w:r>
-          </w:p>
-        </w:tc>
-        <w:tc>
-          <w:tcPr>
-            <w:tcW w:type="dxa" w:w="1296"/>
-          </w:tcPr>
-          <w:p>
-            <w:r/>
-            <w:r>
-              <w:rPr>
-                <w:sz w:val="16"/>
-              </w:rPr>
-              <w:t>Warp/shortcut trope</w:t>
-            </w:r>
-          </w:p>
-        </w:tc>
-        <w:tc>
-          <w:tcPr>
-            <w:tcW w:type="dxa" w:w="1152"/>
-          </w:tcPr>
-          <w:p>
-            <w:r/>
-            <w:r>
-              <w:rPr>
-                <w:sz w:val="16"/>
-              </w:rPr>
-              <w:t>Subversion</w:t>
-            </w:r>
-          </w:p>
-        </w:tc>
-        <w:tc>
-          <w:tcPr>
-            <w:tcW w:type="dxa" w:w="1152"/>
-          </w:tcPr>
-          <w:p>
-            <w:r/>
-            <w:r>
-              <w:rPr>
-                <w:sz w:val="16"/>
-              </w:rPr>
-              <w:t>Deception</w:t>
-            </w:r>
-          </w:p>
-        </w:tc>
-      </w:tr>
-      <w:tr>
-        <w:tc>
-          <w:tcPr>
-            <w:tcW w:type="dxa" w:w="1584"/>
-          </w:tcPr>
-          <w:p>
-            <w:r/>
-            <w:r>
-              <w:rPr>
-                <w:b/>
-                <w:sz w:val="16"/>
-              </w:rPr>
-              <w:t>Rotating Barriers</w:t>
-            </w:r>
-          </w:p>
-        </w:tc>
-        <w:tc>
-          <w:tcPr>
-            <w:tcW w:type="dxa" w:w="2304"/>
-          </w:tcPr>
-          <w:p>
-            <w:r/>
-            <w:r>
-              <w:rPr>
-                <w:sz w:val="16"/>
-              </w:rPr>
-              <w:t>Gates rotate every 2.5 s, alternating which sides of the cell can be entered.</w:t>
-            </w:r>
-          </w:p>
-        </w:tc>
-        <w:tc>
-          <w:tcPr>
-            <w:tcW w:type="dxa" w:w="2304"/>
-          </w:tcPr>
-          <w:p>
-            <w:r/>
-            <w:r>
-              <w:rPr>
-                <w:sz w:val="16"/>
-              </w:rPr>
-              <w:t>An open-looking junction is only half open at any moment, on a readable clock.</w:t>
-            </w:r>
-          </w:p>
-        </w:tc>
-        <w:tc>
-          <w:tcPr>
-            <w:tcW w:type="dxa" w:w="1296"/>
-          </w:tcPr>
-          <w:p>
-            <w:r/>
-            <w:r>
-              <w:rPr>
-                <w:sz w:val="16"/>
-              </w:rPr>
-              <w:t>Junctions</w:t>
-            </w:r>
-          </w:p>
-        </w:tc>
-        <w:tc>
-          <w:tcPr>
-            <w:tcW w:type="dxa" w:w="1152"/>
-          </w:tcPr>
-          <w:p>
-            <w:r/>
-            <w:r>
-              <w:rPr>
-                <w:sz w:val="16"/>
-              </w:rPr>
-              <w:t>Extension</w:t>
-            </w:r>
-          </w:p>
-        </w:tc>
-        <w:tc>
-          <w:tcPr>
-            <w:tcW w:type="dxa" w:w="1152"/>
-          </w:tcPr>
-          <w:p>
-            <w:r/>
-            <w:r>
-              <w:rPr>
-                <w:sz w:val="16"/>
-              </w:rPr>
-              <w:t>Timing; learnable rules</w:t>
-            </w:r>
-          </w:p>
-        </w:tc>
-      </w:tr>
-      <w:tr>
-        <w:tc>
-          <w:tcPr>
-            <w:tcW w:type="dxa" w:w="1584"/>
-          </w:tcPr>
-          <w:p>
-            <w:r/>
-            <w:r>
-              <w:rPr>
-                <w:b/>
-                <w:sz w:val="16"/>
-              </w:rPr>
-              <w:t>Patrolling Obstacles</w:t>
-            </w:r>
-          </w:p>
-        </w:tc>
-        <w:tc>
-          <w:tcPr>
-            <w:tcW w:type="dxa" w:w="2304"/>
-          </w:tcPr>
-          <w:p>
-            <w:r/>
-            <w:r>
-              <w:rPr>
-                <w:sz w:val="16"/>
-              </w:rPr>
-              <w:t>Red spiked orbs move back and forth through side corridors crossing the route.</w:t>
-            </w:r>
-          </w:p>
-        </w:tc>
-        <w:tc>
-          <w:tcPr>
-            <w:tcW w:type="dxa" w:w="2304"/>
-          </w:tcPr>
-          <w:p>
-            <w:r/>
-            <w:r>
-              <w:rPr>
-                <w:sz w:val="16"/>
-              </w:rPr>
-              <w:t>Adds predictable enemies the player observes and times, like maze-chase ghosts.</w:t>
-            </w:r>
-          </w:p>
-        </w:tc>
-        <w:tc>
-          <w:tcPr>
-            <w:tcW w:type="dxa" w:w="1296"/>
-          </w:tcPr>
-          <w:p>
-            <w:r/>
-            <w:r>
-              <w:rPr>
-                <w:sz w:val="16"/>
-              </w:rPr>
-              <w:t>Enemy avoidance</w:t>
-            </w:r>
-          </w:p>
-        </w:tc>
-        <w:tc>
-          <w:tcPr>
-            <w:tcW w:type="dxa" w:w="1152"/>
-          </w:tcPr>
-          <w:p>
-            <w:r/>
-            <w:r>
-              <w:rPr>
-                <w:sz w:val="16"/>
-              </w:rPr>
-              <w:t>Emphasis</w:t>
-            </w:r>
-          </w:p>
-        </w:tc>
-        <w:tc>
-          <w:tcPr>
-            <w:tcW w:type="dxa" w:w="1152"/>
-          </w:tcPr>
-          <w:p>
-            <w:r/>
-            <w:r>
-              <w:rPr>
-                <w:sz w:val="16"/>
-              </w:rPr>
-              <w:t>Timing; memory</w:t>
-            </w:r>
-          </w:p>
-        </w:tc>
-      </w:tr>
-      <w:tr>
-        <w:tc>
-          <w:tcPr>
-            <w:tcW w:type="dxa" w:w="1584"/>
-          </w:tcPr>
-          <w:p>
-            <w:r/>
-            <w:r>
-              <w:rPr>
-                <w:b/>
-                <w:sz w:val="16"/>
-              </w:rPr>
-              <w:t>One-Way Paths</w:t>
-            </w:r>
-          </w:p>
-        </w:tc>
-        <w:tc>
-          <w:tcPr>
-            <w:tcW w:type="dxa" w:w="2304"/>
-          </w:tcPr>
-          <w:p>
-            <w:r/>
-            <w:r>
-              <w:rPr>
-                <w:sz w:val="16"/>
-              </w:rPr>
-              <w:t>Arrow-marked edges can only be crossed in one direction.</w:t>
-            </w:r>
-          </w:p>
-        </w:tc>
-        <w:tc>
-          <w:tcPr>
-            <w:tcW w:type="dxa" w:w="2304"/>
-          </w:tcPr>
-          <w:p>
-            <w:r/>
-            <w:r>
-              <w:rPr>
-                <w:sz w:val="16"/>
-              </w:rPr>
-              <w:t>An open corridor is secretly half closed; choices become commitments.</w:t>
-            </w:r>
-          </w:p>
-        </w:tc>
-        <w:tc>
-          <w:tcPr>
-            <w:tcW w:type="dxa" w:w="1296"/>
-          </w:tcPr>
-          <w:p>
-            <w:r/>
-            <w:r>
-              <w:rPr>
-                <w:sz w:val="16"/>
-              </w:rPr>
-              <w:t>Two-way corridors</w:t>
-            </w:r>
-          </w:p>
-        </w:tc>
-        <w:tc>
-          <w:tcPr>
-            <w:tcW w:type="dxa" w:w="1152"/>
-          </w:tcPr>
-          <w:p>
-            <w:r/>
-            <w:r>
-              <w:rPr>
-                <w:sz w:val="16"/>
-              </w:rPr>
-              <w:t>Subversion</w:t>
-            </w:r>
-          </w:p>
-        </w:tc>
-        <w:tc>
-          <w:tcPr>
-            <w:tcW w:type="dxa" w:w="1152"/>
-          </w:tcPr>
-          <w:p>
-            <w:r/>
-            <w:r>
-              <w:rPr>
-                <w:sz w:val="16"/>
-              </w:rPr>
-              <w:t>Deception; commitment</w:t>
-            </w:r>
-          </w:p>
-        </w:tc>
-      </w:tr>
-      <w:tr>
-        <w:tc>
-          <w:tcPr>
-            <w:tcW w:type="dxa" w:w="1584"/>
-          </w:tcPr>
-          <w:p>
-            <w:r/>
-            <w:r>
-              <w:rPr>
-                <w:b/>
-                <w:sz w:val="16"/>
-              </w:rPr>
-              <w:t>Decoy Destination</w:t>
-            </w:r>
-          </w:p>
-        </w:tc>
-        <w:tc>
-          <w:tcPr>
-            <w:tcW w:type="dxa" w:w="2304"/>
-          </w:tcPr>
-          <w:p>
-            <w:r/>
-            <w:r>
-              <w:rPr>
-                <w:sz w:val="16"/>
-              </w:rPr>
-              <w:t>A fake goal at the end of a dead end sends the player back to Start and reveals the real goal. The real star spins; the decoy's does not.</w:t>
-            </w:r>
-          </w:p>
-        </w:tc>
-        <w:tc>
-          <w:tcPr>
-            <w:tcW w:type="dxa" w:w="2304"/>
-          </w:tcPr>
-          <w:p>
-            <w:r/>
-            <w:r>
-              <w:rPr>
-                <w:sz w:val="16"/>
-              </w:rPr>
-              <w:t>Even the goal can lie, but there is always a subtle, fair tell.</w:t>
-            </w:r>
-          </w:p>
-        </w:tc>
-        <w:tc>
-          <w:tcPr>
-            <w:tcW w:type="dxa" w:w="1296"/>
-          </w:tcPr>
-          <w:p>
-            <w:r/>
-            <w:r>
-              <w:rPr>
-                <w:sz w:val="16"/>
-              </w:rPr>
-              <w:t>Goal clarity</w:t>
-            </w:r>
-          </w:p>
-        </w:tc>
-        <w:tc>
-          <w:tcPr>
-            <w:tcW w:type="dxa" w:w="1152"/>
-          </w:tcPr>
-          <w:p>
-            <w:r/>
-            <w:r>
-              <w:rPr>
-                <w:sz w:val="16"/>
-              </w:rPr>
-              <w:t>Subversion</w:t>
-            </w:r>
-          </w:p>
-        </w:tc>
-        <w:tc>
-          <w:tcPr>
-            <w:tcW w:type="dxa" w:w="1152"/>
-          </w:tcPr>
-          <w:p>
-            <w:r/>
-            <w:r>
-              <w:rPr>
-                <w:sz w:val="16"/>
-              </w:rPr>
-              <w:t>Deception; learnable rules</w:t>
-            </w:r>
-          </w:p>
-        </w:tc>
-      </w:tr>
-      <w:tr>
-        <w:tc>
-          <w:tcPr>
-            <w:tcW w:type="dxa" w:w="1584"/>
-          </w:tcPr>
-          <w:p>
-            <w:r/>
-            <w:r>
-              <w:rPr>
-                <w:b/>
-                <w:sz w:val="16"/>
-              </w:rPr>
-              <w:t>Chasing Hazard</w:t>
-            </w:r>
-          </w:p>
-        </w:tc>
-        <w:tc>
-          <w:tcPr>
-            <w:tcW w:type="dxa" w:w="2304"/>
-          </w:tcPr>
-          <w:p>
-            <w:r/>
-            <w:r>
-              <w:rPr>
-                <w:sz w:val="16"/>
-              </w:rPr>
-              <w:t>A shadow appears 5 s into an attempt and follows the player's trail, slower than the player.</w:t>
-            </w:r>
-          </w:p>
-        </w:tc>
-        <w:tc>
-          <w:tcPr>
-            <w:tcW w:type="dxa" w:w="2304"/>
-          </w:tcPr>
-          <w:p>
-            <w:r/>
-            <w:r>
-              <w:rPr>
-                <w:sz w:val="16"/>
-              </w:rPr>
-              <w:t>The maze reacts to the player's own choices and discourages standing still.</w:t>
-            </w:r>
-          </w:p>
-        </w:tc>
-        <w:tc>
-          <w:tcPr>
-            <w:tcW w:type="dxa" w:w="1296"/>
-          </w:tcPr>
-          <w:p>
-            <w:r/>
-            <w:r>
-              <w:rPr>
-                <w:sz w:val="16"/>
-              </w:rPr>
-              <w:t>Chase enemy, pressure</w:t>
-            </w:r>
-          </w:p>
-        </w:tc>
-        <w:tc>
-          <w:tcPr>
-            <w:tcW w:type="dxa" w:w="1152"/>
-          </w:tcPr>
-          <w:p>
-            <w:r/>
-            <w:r>
-              <w:rPr>
-                <w:sz w:val="16"/>
-              </w:rPr>
-              <w:t>Combination</w:t>
-            </w:r>
-          </w:p>
-        </w:tc>
-        <w:tc>
-          <w:tcPr>
-            <w:tcW w:type="dxa" w:w="1152"/>
-          </w:tcPr>
-          <w:p>
-            <w:r/>
-            <w:r>
-              <w:rPr>
-                <w:sz w:val="16"/>
-              </w:rPr>
-              <w:t>Reactivity; pressure</w:t>
-            </w:r>
-          </w:p>
-        </w:tc>
-      </w:tr>
-      <w:tr>
-        <w:tc>
-          <w:tcPr>
-            <w:tcW w:type="dxa" w:w="1584"/>
-          </w:tcPr>
-          <w:p>
-            <w:r/>
-            <w:r>
-              <w:rPr>
-                <w:b/>
-                <w:sz w:val="16"/>
-              </w:rPr>
-              <w:t>Maze Growth</w:t>
-            </w:r>
-          </w:p>
-        </w:tc>
-        <w:tc>
-          <w:tcPr>
-            <w:tcW w:type="dxa" w:w="2304"/>
-          </w:tcPr>
-          <w:p>
-            <w:r/>
-            <w:r>
-              <w:rPr>
-                <w:sz w:val="16"/>
-              </w:rPr>
-              <w:t>Maze size is (Level + 3) x (Level + 3); obstacles grow in number and variety.</w:t>
-            </w:r>
-          </w:p>
-        </w:tc>
-        <w:tc>
-          <w:tcPr>
-            <w:tcW w:type="dxa" w:w="2304"/>
-          </w:tcPr>
-          <w:p>
-            <w:r/>
-            <w:r>
-              <w:rPr>
-                <w:sz w:val="16"/>
-              </w:rPr>
-              <w:t>Gives the maze more room to hide and combine its lies as skill grows.</w:t>
-            </w:r>
-          </w:p>
-        </w:tc>
-        <w:tc>
-          <w:tcPr>
-            <w:tcW w:type="dxa" w:w="1296"/>
-          </w:tcPr>
-          <w:p>
-            <w:r/>
-            <w:r>
-              <w:rPr>
-                <w:sz w:val="16"/>
-              </w:rPr>
-              <w:t>Difficulty curve, procedural generation</w:t>
-            </w:r>
-          </w:p>
-        </w:tc>
-        <w:tc>
-          <w:tcPr>
-            <w:tcW w:type="dxa" w:w="1152"/>
-          </w:tcPr>
-          <w:p>
-            <w:r/>
-            <w:r>
-              <w:rPr>
-                <w:sz w:val="16"/>
-              </w:rPr>
-              <w:t>Extension</w:t>
-            </w:r>
-          </w:p>
-        </w:tc>
-        <w:tc>
-          <w:tcPr>
-            <w:tcW w:type="dxa" w:w="1152"/>
-          </w:tcPr>
-          <w:p>
-            <w:r/>
-            <w:r>
-              <w:rPr>
-                <w:sz w:val="16"/>
-              </w:rPr>
-              <w:t>Escalating challenge</w:t>
-            </w:r>
-          </w:p>
-        </w:tc>
-      </w:tr>
-      <w:tr>
-        <w:tc>
-          <w:tcPr>
-            <w:tcW w:type="dxa" w:w="1584"/>
-          </w:tcPr>
-          <w:p>
-            <w:r/>
-            <w:r>
-              <w:rPr>
-                <w:b/>
-                <w:sz w:val="16"/>
-              </w:rPr>
-              <w:t>Same-Layout Restart</w:t>
-            </w:r>
-          </w:p>
-        </w:tc>
-        <w:tc>
-          <w:tcPr>
-            <w:tcW w:type="dxa" w:w="2304"/>
-          </w:tcPr>
-          <w:p>
-            <w:r/>
-            <w:r>
-              <w:rPr>
-                <w:sz w:val="16"/>
-              </w:rPr>
-              <w:t>Dying restarts the same maze from the Start with all obstacles reset.</w:t>
-            </w:r>
-          </w:p>
-        </w:tc>
-        <w:tc>
-          <w:tcPr>
-            <w:tcW w:type="dxa" w:w="2304"/>
-          </w:tcPr>
-          <w:p>
-            <w:r/>
-            <w:r>
-              <w:rPr>
-                <w:sz w:val="16"/>
-              </w:rPr>
-              <w:t>A lie you die to once becomes a rule you can plan around.</w:t>
-            </w:r>
-          </w:p>
-        </w:tc>
-        <w:tc>
-          <w:tcPr>
-            <w:tcW w:type="dxa" w:w="1296"/>
-          </w:tcPr>
-          <w:p>
-            <w:r/>
-            <w:r>
-              <w:rPr>
-                <w:sz w:val="16"/>
-              </w:rPr>
-              <w:t>Retry loop</w:t>
-            </w:r>
-          </w:p>
-        </w:tc>
-        <w:tc>
-          <w:tcPr>
-            <w:tcW w:type="dxa" w:w="1152"/>
-          </w:tcPr>
-          <w:p>
-            <w:r/>
-            <w:r>
-              <w:rPr>
-                <w:sz w:val="16"/>
-              </w:rPr>
-              <w:t>Emphasis</w:t>
-            </w:r>
-          </w:p>
-        </w:tc>
-        <w:tc>
-          <w:tcPr>
-            <w:tcW w:type="dxa" w:w="1152"/>
-          </w:tcPr>
-          <w:p>
-            <w:r/>
-            <w:r>
-              <w:rPr>
-                <w:sz w:val="16"/>
-              </w:rPr>
-              <w:t>Memory; fairness</w:t>
             </w:r>
           </w:p>
         </w:tc>

</xml_diff>

<commit_message>
Generate the Word document from DesignDocument.md
The docx is now built directly from the markdown, so the local Word copy
and the GitHub copy always have identical content.
</commit_message>
<xml_diff>
--- a/design/Trust-No-Wall-Descriptive-Document.docx
+++ b/design/Trust-No-Wall-Descriptive-Document.docx
@@ -7,59 +7,54 @@
         <w:pStyle w:val="Title"/>
       </w:pPr>
       <w:r>
-        <w:t>Trust No Wall</w:t>
+        <w:t>Trust No Wall: Descriptive Document</w:t>
       </w:r>
     </w:p>
     <w:p>
       <w:r>
-        <w:rPr>
-          <w:i/>
-        </w:rPr>
-        <w:t>Descriptive Document | CSCI 526 Paired Prototype | Team 7</w:t>
+        <w:t>Team 7: Qiming Xiao, Manas Vardhan</w:t>
       </w:r>
     </w:p>
     <w:p>
+      <w:pPr>
+        <w:pStyle w:val="ListBullet"/>
+      </w:pPr>
       <w:r>
         <w:rPr>
           <w:b/>
         </w:rPr>
-        <w:t xml:space="preserve">Team: </w:t>
+        <w:t>Play online:</w:t>
       </w:r>
       <w:r>
-        <w:t>Qiming Xiao, Manas Vardhan</w:t>
+        <w:t xml:space="preserve"> https://csci-526.github.io/Team7-trust-no-walls/</w:t>
       </w:r>
     </w:p>
     <w:p>
+      <w:pPr>
+        <w:pStyle w:val="ListBullet"/>
+      </w:pPr>
       <w:r>
         <w:rPr>
           <w:b/>
         </w:rPr>
-        <w:t xml:space="preserve">Play online: </w:t>
+        <w:t>Gameplay video:</w:t>
       </w:r>
       <w:r>
-        <w:t>https://csci-526.github.io/Team7-trust-no-walls/</w:t>
+        <w:t xml:space="preserve"> https://drive.google.com/file/d/108_E55riLKDuFTiWyroH48iHKu0jDZD_/view?usp=sharing</w:t>
       </w:r>
     </w:p>
     <w:p>
+      <w:pPr>
+        <w:pStyle w:val="ListBullet"/>
+      </w:pPr>
       <w:r>
         <w:rPr>
           <w:b/>
         </w:rPr>
-        <w:t xml:space="preserve">Gameplay video: </w:t>
+        <w:t>Repository:</w:t>
       </w:r>
       <w:r>
-        <w:t>https://drive.google.com/file/d/108_E55riLKDuFTiWyroH48iHKu0jDZD_/view?usp=sharing</w:t>
-      </w:r>
-    </w:p>
-    <w:p>
-      <w:r>
-        <w:rPr>
-          <w:b/>
-        </w:rPr>
-        <w:t xml:space="preserve">Repository: </w:t>
-      </w:r>
-      <w:r>
-        <w:t>https://github.com/CSCI-526/Team7-trust-no-walls</w:t>
+        <w:t xml:space="preserve"> https://github.com/CSCI-526/Team7-trust-no-walls</w:t>
       </w:r>
     </w:p>
     <w:p>
@@ -80,7 +75,7 @@
         <w:pStyle w:val="Heading1"/>
       </w:pPr>
       <w:r>
-        <w:t>Genre Tropes Research and Twist</w:t>
+        <w:t>Genre tropes research and twist</w:t>
       </w:r>
     </w:p>
     <w:p>
@@ -88,12 +83,7 @@
         <w:pStyle w:val="Heading2"/>
       </w:pPr>
       <w:r>
-        <w:t>Research: three games from the maze genre</w:t>
-      </w:r>
-    </w:p>
-    <w:p>
-      <w:r>
-        <w:t>We looked at three maze games spanning the genre from the arcade era to modern browser games: Pac-Man, Maze Craze: A Game of Cops 'n Robbers, and Level Devil.</w:t>
+        <w:t>Research: three maze games</w:t>
       </w:r>
     </w:p>
     <w:p>
@@ -107,7 +97,7 @@
         <w:t>Pac-Man</w:t>
       </w:r>
       <w:r>
-        <w:t xml:space="preserve"> (Namco, arcade, 1980). The player navigates a fixed, fully visible maze, collecting pellets while avoiding four ghosts, each with its own movement pattern. The maze never changes: what you see is exactly what is there, and mastery comes from learning the ghosts' movement, not the maze.</w:t>
+        <w:t xml:space="preserve"> (Namco, 1980). The player navigates a fixed, fully visible maze, collecting pellets while avoiding four ghosts, each with its own movement pattern. The maze never changes; mastery comes from learning the ghosts, not the maze.</w:t>
       </w:r>
     </w:p>
     <w:p>
@@ -121,7 +111,7 @@
         <w:t>Maze Craze: A Game of Cops 'n Robbers</w:t>
       </w:r>
       <w:r>
-        <w:t xml:space="preserve"> (Atari, Atari 2600). Two players race through a randomly generated top-down maze. Some optional game variants add novelty rules, such as a maze that is invisible and only briefly revealed, or a false wall a player can drop to block an opponent. These are side modes layered on an otherwise honest maze.</w:t>
+        <w:t xml:space="preserve"> (Atari 2600). Two players race through a randomly generated top-down maze. Optional variants add novelty rules, such as a maze that is invisible and only briefly revealed, but these are side modes on an otherwise honest maze.</w:t>
       </w:r>
     </w:p>
     <w:p>
@@ -135,7 +125,7 @@
         <w:t>Level Devil</w:t>
       </w:r>
       <w:r>
-        <w:t xml:space="preserve"> (Unept (Adam Corey), browser 2023). A minimalist trial-and-error game in which floors turn into spikes, ceilings fall and platforms vanish the moment you commit. The level actively deceives the player, who progresses only by dying, memorizing and retrying the identical level, with no telegraphing on a first attempt.</w:t>
+        <w:t xml:space="preserve"> (Unept (Adam Corey), 2023). A trial-and-error game where floors become spikes and platforms vanish when you commit. The level deceives the player, who progresses by dying, memorizing and retrying, with no warning on a first attempt and no guarantee a trap is fair.</w:t>
       </w:r>
     </w:p>
     <w:p>
@@ -143,47 +133,47 @@
         <w:pStyle w:val="Heading2"/>
       </w:pPr>
       <w:r>
-        <w:t>Shared genre tropes</w:t>
+        <w:t>Shared tropes</w:t>
       </w:r>
     </w:p>
     <w:p>
       <w:pPr>
-        <w:pStyle w:val="ListBullet"/>
+        <w:pStyle w:val="ListNumber"/>
       </w:pPr>
       <w:r>
-        <w:t>The maze is a stable, observable puzzle: what you can see is the truth of the space, and skill means reading the visible layout correctly.</w:t>
+        <w:t>The maze is a stable, observable puzzle: what you see is the truth, and skill means reading the layout.</w:t>
       </w:r>
     </w:p>
     <w:p>
       <w:pPr>
-        <w:pStyle w:val="ListBullet"/>
+        <w:pStyle w:val="ListNumber"/>
       </w:pPr>
       <w:r>
-        <w:t>Hidden or false information, when it exists (Maze Craze's invisible-maze variant), is an optional novelty mode, not the core condition of play.</w:t>
+        <w:t>Hidden or false information, when present, is an optional side mode, not the core of play.</w:t>
       </w:r>
     </w:p>
     <w:p>
       <w:pPr>
-        <w:pStyle w:val="ListBullet"/>
+        <w:pStyle w:val="ListNumber"/>
       </w:pPr>
       <w:r>
-        <w:t>When deception is the whole point (Level Devil), it has no fairness guarantee: nothing checks that a level stays completable, and a trap can be an unavoidable first-try loss with no rule to learn from.</w:t>
+        <w:t>When deception is the whole point (Level Devil), there is no fairness guarantee or rule to learn from.</w:t>
       </w:r>
     </w:p>
     <w:p>
       <w:pPr>
-        <w:pStyle w:val="ListBullet"/>
+        <w:pStyle w:val="ListNumber"/>
       </w:pPr>
       <w:r>
-        <w:t>Failing sends the player back to the same, unchanged challenge: only the player's knowledge improves.</w:t>
+        <w:t>Failing restarts the same challenge; only the player's knowledge improves.</w:t>
       </w:r>
     </w:p>
     <w:p>
       <w:pPr>
-        <w:pStyle w:val="ListBullet"/>
+        <w:pStyle w:val="ListNumber"/>
       </w:pPr>
       <w:r>
-        <w:t>Simple directional movement, a clear start and goal, and difficulty that rises through larger or more complex layouts and more threats.</w:t>
+        <w:t>Simple directional movement, a clear start and goal, and difficulty that rises through bigger layouts and more threats.</w:t>
       </w:r>
     </w:p>
     <w:p>
@@ -191,7 +181,7 @@
         <w:pStyle w:val="Heading2"/>
       </w:pPr>
       <w:r>
-        <w:t>Twist and why it is innovative</w:t>
+        <w:t>Twist and justification</w:t>
       </w:r>
     </w:p>
     <w:p>
@@ -199,10 +189,10 @@
         <w:rPr>
           <w:b/>
         </w:rPr>
-        <w:t xml:space="preserve">Twist: </w:t>
+        <w:t>Twist:</w:t>
       </w:r>
       <w:r>
-        <w:t>Every researched game assumes a static, trustworthy maze solved by observation. Trust No Wall breaks that assumption: the maze is deceptive (invisible walls, one-way corridors that look open both ways, a decoy goal) and reactive (walls that slide, vanish and rewire on triggers, floors that collapse, and a shadow that follows your own trail). Two guarantees keep it a fair maze game rather than a troll game: every generated level is checked by a solvability validator before it is shown, so a completable route always exists and no reachable cell is a trap; and every lie follows a fixed, telegraphed rule (a wall flashes and shows an arrow before it slides, plates share a color with the walls they control, memory tiles reveal nearby hidden walls, the real goal's star spins while a decoy's does not).</w:t>
+        <w:t xml:space="preserve"> the maze itself is deceptive and changing (invisible walls, sliding and disappearing walls, trigger plates that rewire walls, a decoy goal, a shadow that follows your trail), yet every level is checked to be solvable and every lie follows a fixed, telegraphed rule.</w:t>
       </w:r>
     </w:p>
     <w:p>
@@ -210,64 +200,28 @@
         <w:rPr>
           <w:b/>
         </w:rPr>
-        <w:t xml:space="preserve">Why it is innovative: </w:t>
+        <w:t>Why it is innovative:</w:t>
       </w:r>
-      <w:r/>
-    </w:p>
-    <w:p>
-      <w:pPr>
-        <w:pStyle w:val="ListBullet"/>
-      </w:pPr>
+      <w:r>
+        <w:t xml:space="preserve"> it </w:t>
+      </w:r>
       <w:r>
         <w:rPr>
           <w:b/>
         </w:rPr>
-        <w:t xml:space="preserve">Subversion. </w:t>
+        <w:t>subverts</w:t>
       </w:r>
       <w:r>
-        <w:t>It subverts the honest, fully visible maze (Pac-Man) and turns hidden information from an occasional side mode (Maze Craze) into the constant condition of the whole game.</w:t>
+        <w:t xml:space="preserve"> tropes 1 and 2 by making deception the constant condition of the whole game instead of an optional mode on an honest maze. It </w:t>
       </w:r>
-    </w:p>
-    <w:p>
-      <w:pPr>
-        <w:pStyle w:val="ListBullet"/>
-      </w:pPr>
       <w:r>
         <w:rPr>
           <w:b/>
         </w:rPr>
-        <w:t xml:space="preserve">Combination. </w:t>
+        <w:t>combines</w:t>
       </w:r>
       <w:r>
-        <w:t>It combines Maze Craze's hidden-maze idea with Level Devil's committed deception, but applies it to spatial maze navigation instead of platforming reflexes.</w:t>
-      </w:r>
-    </w:p>
-    <w:p>
-      <w:pPr>
-        <w:pStyle w:val="ListBullet"/>
-      </w:pPr>
-      <w:r>
-        <w:rPr>
-          <w:b/>
-        </w:rPr>
-        <w:t xml:space="preserve">Extension. </w:t>
-      </w:r>
-      <w:r>
-        <w:t>It fixes Level Devil's weak point with a solvability guarantee and learnable, telegraphed rules for every hazard, so deception is always fair.</w:t>
-      </w:r>
-    </w:p>
-    <w:p>
-      <w:pPr>
-        <w:pStyle w:val="ListBullet"/>
-      </w:pPr>
-      <w:r>
-        <w:rPr>
-          <w:b/>
-        </w:rPr>
-        <w:t xml:space="preserve">Emphasis. </w:t>
-      </w:r>
-      <w:r>
-        <w:t>It keeps the restart-to-the-same-challenge trope on purpose: dying restarts the same layout, so a lie you die to once becomes a rule you can plan around, and remembering the maze's specific lies becomes the skill.</w:t>
+        <w:t xml:space="preserve"> Maze Craze's hidden-maze idea with Level Devil's committed deception, but applies it to maze navigation instead of platforming. It fixes trope 3's weakness with a solvability guarantee and visible tells (a wall flashes before it moves, plates share a color with their walls, memory tiles reveal hidden walls, the real goal's star spins while a decoy's does not). It deliberately keeps trope 4: dying restarts the same layout, so remembering the maze's specific lies becomes the skill.</w:t>
       </w:r>
     </w:p>
     <w:p>
@@ -275,7 +229,7 @@
         <w:pStyle w:val="Heading1"/>
       </w:pPr>
       <w:r>
-        <w:t>Short Prototype Description</w:t>
+        <w:t>Short prototype description</w:t>
       </w:r>
     </w:p>
     <w:p>
@@ -284,252 +238,22 @@
       </w:r>
     </w:p>
     <w:p>
-      <w:pPr>
-        <w:pStyle w:val="Heading2"/>
-      </w:pPr>
       <w:r>
-        <w:t>Controls</w:t>
+        <w:rPr>
+          <w:b/>
+        </w:rPr>
+        <w:t>Controls:</w:t>
+      </w:r>
+      <w:r>
+        <w:t xml:space="preserve"> WASD or Arrow keys move one cell per step (hold to keep moving); Space or Enter starts and skips intro cards; R restarts the attempt; P or Esc pauses; M mutes; F2 toggles a demo autopilot.</w:t>
       </w:r>
     </w:p>
-    <w:tbl>
-      <w:tblPr>
-        <w:tblStyle w:val="TableGrid"/>
-        <w:tblW w:type="auto" w:w="0"/>
-        <w:jc w:val="center"/>
-        <w:tblLook w:firstColumn="1" w:firstRow="1" w:lastColumn="0" w:lastRow="0" w:noHBand="0" w:noVBand="1" w:val="04A0"/>
-      </w:tblPr>
-      <w:tblGrid>
-        <w:gridCol w:w="4968"/>
-        <w:gridCol w:w="4968"/>
-      </w:tblGrid>
-      <w:tr>
-        <w:tc>
-          <w:tcPr>
-            <w:tcW w:type="dxa" w:w="2592"/>
-            <w:shd w:val="clear" w:color="auto" w:fill="D9E2F3"/>
-          </w:tcPr>
-          <w:p>
-            <w:r/>
-            <w:r>
-              <w:rPr>
-                <w:b/>
-                <w:sz w:val="20"/>
-              </w:rPr>
-              <w:t>Input</w:t>
-            </w:r>
-          </w:p>
-        </w:tc>
-        <w:tc>
-          <w:tcPr>
-            <w:tcW w:type="dxa" w:w="7056"/>
-            <w:shd w:val="clear" w:color="auto" w:fill="D9E2F3"/>
-          </w:tcPr>
-          <w:p>
-            <w:r/>
-            <w:r>
-              <w:rPr>
-                <w:b/>
-                <w:sz w:val="20"/>
-              </w:rPr>
-              <w:t>Action</w:t>
-            </w:r>
-          </w:p>
-        </w:tc>
-      </w:tr>
-      <w:tr>
-        <w:tc>
-          <w:tcPr>
-            <w:tcW w:type="dxa" w:w="2592"/>
-          </w:tcPr>
-          <w:p>
-            <w:r/>
-            <w:r>
-              <w:rPr>
-                <w:b/>
-                <w:sz w:val="20"/>
-              </w:rPr>
-              <w:t>WASD / Arrow keys</w:t>
-            </w:r>
-          </w:p>
-        </w:tc>
-        <w:tc>
-          <w:tcPr>
-            <w:tcW w:type="dxa" w:w="7056"/>
-          </w:tcPr>
-          <w:p>
-            <w:r/>
-            <w:r>
-              <w:rPr>
-                <w:sz w:val="20"/>
-              </w:rPr>
-              <w:t>Move one cell per step; hold to keep moving</w:t>
-            </w:r>
-          </w:p>
-        </w:tc>
-      </w:tr>
-      <w:tr>
-        <w:tc>
-          <w:tcPr>
-            <w:tcW w:type="dxa" w:w="2592"/>
-          </w:tcPr>
-          <w:p>
-            <w:r/>
-            <w:r>
-              <w:rPr>
-                <w:b/>
-                <w:sz w:val="20"/>
-              </w:rPr>
-              <w:t>Space / Enter</w:t>
-            </w:r>
-          </w:p>
-        </w:tc>
-        <w:tc>
-          <w:tcPr>
-            <w:tcW w:type="dxa" w:w="7056"/>
-          </w:tcPr>
-          <w:p>
-            <w:r/>
-            <w:r>
-              <w:rPr>
-                <w:sz w:val="20"/>
-              </w:rPr>
-              <w:t>Start the game; skip an intro card</w:t>
-            </w:r>
-          </w:p>
-        </w:tc>
-      </w:tr>
-      <w:tr>
-        <w:tc>
-          <w:tcPr>
-            <w:tcW w:type="dxa" w:w="2592"/>
-          </w:tcPr>
-          <w:p>
-            <w:r/>
-            <w:r>
-              <w:rPr>
-                <w:b/>
-                <w:sz w:val="20"/>
-              </w:rPr>
-              <w:t>R</w:t>
-            </w:r>
-          </w:p>
-        </w:tc>
-        <w:tc>
-          <w:tcPr>
-            <w:tcW w:type="dxa" w:w="7056"/>
-          </w:tcPr>
-          <w:p>
-            <w:r/>
-            <w:r>
-              <w:rPr>
-                <w:sz w:val="20"/>
-              </w:rPr>
-              <w:t>Restart the current attempt (same layout)</w:t>
-            </w:r>
-          </w:p>
-        </w:tc>
-      </w:tr>
-      <w:tr>
-        <w:tc>
-          <w:tcPr>
-            <w:tcW w:type="dxa" w:w="2592"/>
-          </w:tcPr>
-          <w:p>
-            <w:r/>
-            <w:r>
-              <w:rPr>
-                <w:b/>
-                <w:sz w:val="20"/>
-              </w:rPr>
-              <w:t>P / Esc</w:t>
-            </w:r>
-          </w:p>
-        </w:tc>
-        <w:tc>
-          <w:tcPr>
-            <w:tcW w:type="dxa" w:w="7056"/>
-          </w:tcPr>
-          <w:p>
-            <w:r/>
-            <w:r>
-              <w:rPr>
-                <w:sz w:val="20"/>
-              </w:rPr>
-              <w:t>Pause</w:t>
-            </w:r>
-          </w:p>
-        </w:tc>
-      </w:tr>
-      <w:tr>
-        <w:tc>
-          <w:tcPr>
-            <w:tcW w:type="dxa" w:w="2592"/>
-          </w:tcPr>
-          <w:p>
-            <w:r/>
-            <w:r>
-              <w:rPr>
-                <w:b/>
-                <w:sz w:val="20"/>
-              </w:rPr>
-              <w:t>M</w:t>
-            </w:r>
-          </w:p>
-        </w:tc>
-        <w:tc>
-          <w:tcPr>
-            <w:tcW w:type="dxa" w:w="7056"/>
-          </w:tcPr>
-          <w:p>
-            <w:r/>
-            <w:r>
-              <w:rPr>
-                <w:sz w:val="20"/>
-              </w:rPr>
-              <w:t>Mute</w:t>
-            </w:r>
-          </w:p>
-        </w:tc>
-      </w:tr>
-      <w:tr>
-        <w:tc>
-          <w:tcPr>
-            <w:tcW w:type="dxa" w:w="2592"/>
-          </w:tcPr>
-          <w:p>
-            <w:r/>
-            <w:r>
-              <w:rPr>
-                <w:b/>
-                <w:sz w:val="20"/>
-              </w:rPr>
-              <w:t>F2</w:t>
-            </w:r>
-          </w:p>
-        </w:tc>
-        <w:tc>
-          <w:tcPr>
-            <w:tcW w:type="dxa" w:w="7056"/>
-          </w:tcPr>
-          <w:p>
-            <w:r/>
-            <w:r>
-              <w:rPr>
-                <w:sz w:val="20"/>
-              </w:rPr>
-              <w:t>Toggle the demo autopilot</w:t>
-            </w:r>
-          </w:p>
-        </w:tc>
-      </w:tr>
-    </w:tbl>
-    <w:p/>
     <w:p>
       <w:pPr>
         <w:pStyle w:val="Heading1"/>
       </w:pPr>
       <w:r>
-        <w:t>Mechanic Matrices: Twist and Mechanics Matrix (core mechanic)</w:t>
+        <w:t>Twist and Mechanics Matrix (core mechanic)</w:t>
       </w:r>
     </w:p>
     <w:tbl>
@@ -550,7 +274,7 @@
       <w:tr>
         <w:tc>
           <w:tcPr>
-            <w:tcW w:type="dxa" w:w="1584"/>
+            <w:tcW w:type="dxa" w:w="1656"/>
             <w:shd w:val="clear" w:color="auto" w:fill="D9E2F3"/>
           </w:tcPr>
           <w:p>
@@ -566,7 +290,7 @@
         </w:tc>
         <w:tc>
           <w:tcPr>
-            <w:tcW w:type="dxa" w:w="2304"/>
+            <w:tcW w:type="dxa" w:w="1656"/>
             <w:shd w:val="clear" w:color="auto" w:fill="D9E2F3"/>
           </w:tcPr>
           <w:p>
@@ -582,7 +306,7 @@
         </w:tc>
         <w:tc>
           <w:tcPr>
-            <w:tcW w:type="dxa" w:w="2304"/>
+            <w:tcW w:type="dxa" w:w="1656"/>
             <w:shd w:val="clear" w:color="auto" w:fill="D9E2F3"/>
           </w:tcPr>
           <w:p>
@@ -598,7 +322,7 @@
         </w:tc>
         <w:tc>
           <w:tcPr>
-            <w:tcW w:type="dxa" w:w="1296"/>
+            <w:tcW w:type="dxa" w:w="1656"/>
             <w:shd w:val="clear" w:color="auto" w:fill="D9E2F3"/>
           </w:tcPr>
           <w:p>
@@ -614,7 +338,7 @@
         </w:tc>
         <w:tc>
           <w:tcPr>
-            <w:tcW w:type="dxa" w:w="1152"/>
+            <w:tcW w:type="dxa" w:w="1656"/>
             <w:shd w:val="clear" w:color="auto" w:fill="D9E2F3"/>
           </w:tcPr>
           <w:p>
@@ -630,7 +354,7 @@
         </w:tc>
         <w:tc>
           <w:tcPr>
-            <w:tcW w:type="dxa" w:w="1152"/>
+            <w:tcW w:type="dxa" w:w="1656"/>
             <w:shd w:val="clear" w:color="auto" w:fill="D9E2F3"/>
           </w:tcPr>
           <w:p>
@@ -648,22 +372,7 @@
       <w:tr>
         <w:tc>
           <w:tcPr>
-            <w:tcW w:type="dxa" w:w="1584"/>
-          </w:tcPr>
-          <w:p>
-            <w:r/>
-            <w:r>
-              <w:rPr>
-                <w:b/>
-                <w:sz w:val="18"/>
-              </w:rPr>
-              <w:t>Deceptive, Changing Maze (Core Mechanic)</w:t>
-            </w:r>
-          </w:p>
-        </w:tc>
-        <w:tc>
-          <w:tcPr>
-            <w:tcW w:type="dxa" w:w="2304"/>
+            <w:tcW w:type="dxa" w:w="1656"/>
           </w:tcPr>
           <w:p>
             <w:r/>
@@ -671,13 +380,13 @@
               <w:rPr>
                 <w:sz w:val="18"/>
               </w:rPr>
-              <w:t>The maze's walls and floor hide, move, vanish and rewire according to fixed rules while the player navigates it.</w:t>
+              <w:t>Deceptive, Changing Maze (core mechanic)</w:t>
             </w:r>
           </w:p>
         </w:tc>
         <w:tc>
           <w:tcPr>
-            <w:tcW w:type="dxa" w:w="2304"/>
+            <w:tcW w:type="dxa" w:w="1656"/>
           </w:tcPr>
           <w:p>
             <w:r/>
@@ -685,13 +394,13 @@
               <w:rPr>
                 <w:sz w:val="18"/>
               </w:rPr>
-              <w:t>This is the twist: the player cannot trust what they see and must learn each rule instead of just reading the map.</w:t>
+              <w:t>The maze's walls and floor hide, move, vanish and rewire according to fixed, telegraphed rules while the player navigates from Start to Destination.</w:t>
             </w:r>
           </w:p>
         </w:tc>
         <w:tc>
           <w:tcPr>
-            <w:tcW w:type="dxa" w:w="1296"/>
+            <w:tcW w:type="dxa" w:w="1656"/>
           </w:tcPr>
           <w:p>
             <w:r/>
@@ -699,13 +408,27 @@
               <w:rPr>
                 <w:sz w:val="18"/>
               </w:rPr>
-              <w:t>Maze layout, walls, navigation, goal</w:t>
+              <w:t>It is the twist: the player cannot trust the visible map and must learn each rule, and dying restarts the same layout so every lie can be learned.</w:t>
             </w:r>
           </w:p>
         </w:tc>
         <w:tc>
           <w:tcPr>
-            <w:tcW w:type="dxa" w:w="1152"/>
+            <w:tcW w:type="dxa" w:w="1656"/>
+          </w:tcPr>
+          <w:p>
+            <w:r/>
+            <w:r>
+              <w:rPr>
+                <w:sz w:val="18"/>
+              </w:rPr>
+              <w:t>Maze layout, walls, navigation, the goal, the retry loop</w:t>
+            </w:r>
+          </w:p>
+        </w:tc>
+        <w:tc>
+          <w:tcPr>
+            <w:tcW w:type="dxa" w:w="1656"/>
           </w:tcPr>
           <w:p>
             <w:r/>
@@ -719,7 +442,7 @@
         </w:tc>
         <w:tc>
           <w:tcPr>
-            <w:tcW w:type="dxa" w:w="1152"/>
+            <w:tcW w:type="dxa" w:w="1656"/>
           </w:tcPr>
           <w:p>
             <w:r/>
@@ -727,7 +450,7 @@
               <w:rPr>
                 <w:sz w:val="18"/>
               </w:rPr>
-              <w:t>Deception; learnable rules</w:t>
+              <w:t>Exploration, timing, memory</w:t>
             </w:r>
           </w:p>
         </w:tc>
@@ -736,7 +459,7 @@
     <w:p/>
     <w:p>
       <w:pPr>
-        <w:pStyle w:val="Heading2"/>
+        <w:pStyle w:val="Heading1"/>
       </w:pPr>
       <w:r>
         <w:t>Level progression</w:t>
@@ -757,7 +480,7 @@
       <w:tr>
         <w:tc>
           <w:tcPr>
-            <w:tcW w:type="dxa" w:w="1152"/>
+            <w:tcW w:type="dxa" w:w="3312"/>
             <w:shd w:val="clear" w:color="auto" w:fill="D9E2F3"/>
           </w:tcPr>
           <w:p>
@@ -773,7 +496,7 @@
         </w:tc>
         <w:tc>
           <w:tcPr>
-            <w:tcW w:type="dxa" w:w="1872"/>
+            <w:tcW w:type="dxa" w:w="3312"/>
             <w:shd w:val="clear" w:color="auto" w:fill="D9E2F3"/>
           </w:tcPr>
           <w:p>
@@ -789,7 +512,7 @@
         </w:tc>
         <w:tc>
           <w:tcPr>
-            <w:tcW w:type="dxa" w:w="6624"/>
+            <w:tcW w:type="dxa" w:w="3312"/>
             <w:shd w:val="clear" w:color="auto" w:fill="D9E2F3"/>
           </w:tcPr>
           <w:p>
@@ -799,7 +522,7 @@
                 <w:b/>
                 <w:sz w:val="20"/>
               </w:rPr>
-              <w:t>New mechanics</w:t>
+              <w:t>New obstacles</w:t>
             </w:r>
           </w:p>
         </w:tc>
@@ -807,13 +530,12 @@
       <w:tr>
         <w:tc>
           <w:tcPr>
-            <w:tcW w:type="dxa" w:w="1152"/>
+            <w:tcW w:type="dxa" w:w="3312"/>
           </w:tcPr>
           <w:p>
             <w:r/>
             <w:r>
               <w:rPr>
-                <w:b/>
                 <w:sz w:val="20"/>
               </w:rPr>
               <w:t>1</w:t>
@@ -822,7 +544,7 @@
         </w:tc>
         <w:tc>
           <w:tcPr>
-            <w:tcW w:type="dxa" w:w="1872"/>
+            <w:tcW w:type="dxa" w:w="3312"/>
           </w:tcPr>
           <w:p>
             <w:r/>
@@ -836,7 +558,7 @@
         </w:tc>
         <w:tc>
           <w:tcPr>
-            <w:tcW w:type="dxa" w:w="6624"/>
+            <w:tcW w:type="dxa" w:w="3312"/>
           </w:tcPr>
           <w:p>
             <w:r/>
@@ -844,7 +566,7 @@
               <w:rPr>
                 <w:sz w:val="20"/>
               </w:rPr>
-              <w:t>None: basic maze with Start and Destination</w:t>
+              <w:t>None: basic maze</w:t>
             </w:r>
           </w:p>
         </w:tc>
@@ -852,13 +574,12 @@
       <w:tr>
         <w:tc>
           <w:tcPr>
-            <w:tcW w:type="dxa" w:w="1152"/>
+            <w:tcW w:type="dxa" w:w="3312"/>
           </w:tcPr>
           <w:p>
             <w:r/>
             <w:r>
               <w:rPr>
-                <w:b/>
                 <w:sz w:val="20"/>
               </w:rPr>
               <w:t>2</w:t>
@@ -867,7 +588,7 @@
         </w:tc>
         <w:tc>
           <w:tcPr>
-            <w:tcW w:type="dxa" w:w="1872"/>
+            <w:tcW w:type="dxa" w:w="3312"/>
           </w:tcPr>
           <w:p>
             <w:r/>
@@ -881,7 +602,7 @@
         </w:tc>
         <w:tc>
           <w:tcPr>
-            <w:tcW w:type="dxa" w:w="6624"/>
+            <w:tcW w:type="dxa" w:w="3312"/>
           </w:tcPr>
           <w:p>
             <w:r/>
@@ -897,13 +618,12 @@
       <w:tr>
         <w:tc>
           <w:tcPr>
-            <w:tcW w:type="dxa" w:w="1152"/>
+            <w:tcW w:type="dxa" w:w="3312"/>
           </w:tcPr>
           <w:p>
             <w:r/>
             <w:r>
               <w:rPr>
-                <w:b/>
                 <w:sz w:val="20"/>
               </w:rPr>
               <w:t>3</w:t>
@@ -912,7 +632,7 @@
         </w:tc>
         <w:tc>
           <w:tcPr>
-            <w:tcW w:type="dxa" w:w="1872"/>
+            <w:tcW w:type="dxa" w:w="3312"/>
           </w:tcPr>
           <w:p>
             <w:r/>
@@ -926,7 +646,7 @@
         </w:tc>
         <w:tc>
           <w:tcPr>
-            <w:tcW w:type="dxa" w:w="6624"/>
+            <w:tcW w:type="dxa" w:w="3312"/>
           </w:tcPr>
           <w:p>
             <w:r/>
@@ -942,13 +662,12 @@
       <w:tr>
         <w:tc>
           <w:tcPr>
-            <w:tcW w:type="dxa" w:w="1152"/>
+            <w:tcW w:type="dxa" w:w="3312"/>
           </w:tcPr>
           <w:p>
             <w:r/>
             <w:r>
               <w:rPr>
-                <w:b/>
                 <w:sz w:val="20"/>
               </w:rPr>
               <w:t>4</w:t>
@@ -957,7 +676,7 @@
         </w:tc>
         <w:tc>
           <w:tcPr>
-            <w:tcW w:type="dxa" w:w="1872"/>
+            <w:tcW w:type="dxa" w:w="3312"/>
           </w:tcPr>
           <w:p>
             <w:r/>
@@ -971,7 +690,7 @@
         </w:tc>
         <w:tc>
           <w:tcPr>
-            <w:tcW w:type="dxa" w:w="6624"/>
+            <w:tcW w:type="dxa" w:w="3312"/>
           </w:tcPr>
           <w:p>
             <w:r/>
@@ -979,7 +698,7 @@
               <w:rPr>
                 <w:sz w:val="20"/>
               </w:rPr>
-              <w:t>Collapsing Tiles, Trigger Walls (+ one earlier mechanic)</w:t>
+              <w:t>Collapsing Tiles, Trigger Walls (+ one earlier obstacle)</w:t>
             </w:r>
           </w:p>
         </w:tc>
@@ -987,13 +706,12 @@
       <w:tr>
         <w:tc>
           <w:tcPr>
-            <w:tcW w:type="dxa" w:w="1152"/>
+            <w:tcW w:type="dxa" w:w="3312"/>
           </w:tcPr>
           <w:p>
             <w:r/>
             <w:r>
               <w:rPr>
-                <w:b/>
                 <w:sz w:val="20"/>
               </w:rPr>
               <w:t>5</w:t>
@@ -1002,7 +720,7 @@
         </w:tc>
         <w:tc>
           <w:tcPr>
-            <w:tcW w:type="dxa" w:w="1872"/>
+            <w:tcW w:type="dxa" w:w="3312"/>
           </w:tcPr>
           <w:p>
             <w:r/>
@@ -1016,7 +734,7 @@
         </w:tc>
         <w:tc>
           <w:tcPr>
-            <w:tcW w:type="dxa" w:w="6624"/>
+            <w:tcW w:type="dxa" w:w="3312"/>
           </w:tcPr>
           <w:p>
             <w:r/>
@@ -1024,7 +742,7 @@
               <w:rPr>
                 <w:sz w:val="20"/>
               </w:rPr>
-              <w:t>Teleport Tiles, Rotating Barriers (+ one earlier mechanic)</w:t>
+              <w:t>Teleporters, Rotating Gates (+ one earlier obstacle)</w:t>
             </w:r>
           </w:p>
         </w:tc>
@@ -1032,13 +750,12 @@
       <w:tr>
         <w:tc>
           <w:tcPr>
-            <w:tcW w:type="dxa" w:w="1152"/>
+            <w:tcW w:type="dxa" w:w="3312"/>
           </w:tcPr>
           <w:p>
             <w:r/>
             <w:r>
               <w:rPr>
-                <w:b/>
                 <w:sz w:val="20"/>
               </w:rPr>
               <w:t>6</w:t>
@@ -1047,7 +764,7 @@
         </w:tc>
         <w:tc>
           <w:tcPr>
-            <w:tcW w:type="dxa" w:w="1872"/>
+            <w:tcW w:type="dxa" w:w="3312"/>
           </w:tcPr>
           <w:p>
             <w:r/>
@@ -1061,7 +778,7 @@
         </w:tc>
         <w:tc>
           <w:tcPr>
-            <w:tcW w:type="dxa" w:w="6624"/>
+            <w:tcW w:type="dxa" w:w="3312"/>
           </w:tcPr>
           <w:p>
             <w:r/>
@@ -1069,7 +786,7 @@
               <w:rPr>
                 <w:sz w:val="20"/>
               </w:rPr>
-              <w:t>Patrolling Obstacles, One-Way Paths (+ one earlier mechanic)</w:t>
+              <w:t>Patrols, One-Way Paths (+ one earlier obstacle)</w:t>
             </w:r>
           </w:p>
         </w:tc>
@@ -1077,13 +794,12 @@
       <w:tr>
         <w:tc>
           <w:tcPr>
-            <w:tcW w:type="dxa" w:w="1152"/>
+            <w:tcW w:type="dxa" w:w="3312"/>
           </w:tcPr>
           <w:p>
             <w:r/>
             <w:r>
               <w:rPr>
-                <w:b/>
                 <w:sz w:val="20"/>
               </w:rPr>
               <w:t>7</w:t>
@@ -1092,7 +808,7 @@
         </w:tc>
         <w:tc>
           <w:tcPr>
-            <w:tcW w:type="dxa" w:w="1872"/>
+            <w:tcW w:type="dxa" w:w="3312"/>
           </w:tcPr>
           <w:p>
             <w:r/>
@@ -1106,7 +822,7 @@
         </w:tc>
         <w:tc>
           <w:tcPr>
-            <w:tcW w:type="dxa" w:w="6624"/>
+            <w:tcW w:type="dxa" w:w="3312"/>
           </w:tcPr>
           <w:p>
             <w:r/>
@@ -1114,7 +830,7 @@
               <w:rPr>
                 <w:sz w:val="20"/>
               </w:rPr>
-              <w:t>Decoy Destination (+ one earlier mechanic)</w:t>
+              <w:t>Decoy Destination (+ one earlier obstacle)</w:t>
             </w:r>
           </w:p>
         </w:tc>
@@ -1122,13 +838,12 @@
       <w:tr>
         <w:tc>
           <w:tcPr>
-            <w:tcW w:type="dxa" w:w="1152"/>
+            <w:tcW w:type="dxa" w:w="3312"/>
           </w:tcPr>
           <w:p>
             <w:r/>
             <w:r>
               <w:rPr>
-                <w:b/>
                 <w:sz w:val="20"/>
               </w:rPr>
               <w:t>8</w:t>
@@ -1137,7 +852,7 @@
         </w:tc>
         <w:tc>
           <w:tcPr>
-            <w:tcW w:type="dxa" w:w="1872"/>
+            <w:tcW w:type="dxa" w:w="3312"/>
           </w:tcPr>
           <w:p>
             <w:r/>
@@ -1151,7 +866,7 @@
         </w:tc>
         <w:tc>
           <w:tcPr>
-            <w:tcW w:type="dxa" w:w="6624"/>
+            <w:tcW w:type="dxa" w:w="3312"/>
           </w:tcPr>
           <w:p>
             <w:r/>
@@ -1159,7 +874,7 @@
               <w:rPr>
                 <w:sz w:val="20"/>
               </w:rPr>
-              <w:t>Chasing Hazard (+ one earlier mechanic)</w:t>
+              <w:t>Chasing Shadow (+ one earlier obstacle)</w:t>
             </w:r>
           </w:p>
         </w:tc>
@@ -1167,13 +882,12 @@
       <w:tr>
         <w:tc>
           <w:tcPr>
-            <w:tcW w:type="dxa" w:w="1152"/>
+            <w:tcW w:type="dxa" w:w="3312"/>
           </w:tcPr>
           <w:p>
             <w:r/>
             <w:r>
               <w:rPr>
-                <w:b/>
                 <w:sz w:val="20"/>
               </w:rPr>
               <w:t>9+</w:t>
@@ -1182,7 +896,7 @@
         </w:tc>
         <w:tc>
           <w:tcPr>
-            <w:tcW w:type="dxa" w:w="1872"/>
+            <w:tcW w:type="dxa" w:w="3312"/>
           </w:tcPr>
           <w:p>
             <w:r/>
@@ -1196,7 +910,7 @@
         </w:tc>
         <w:tc>
           <w:tcPr>
-            <w:tcW w:type="dxa" w:w="6624"/>
+            <w:tcW w:type="dxa" w:w="3312"/>
           </w:tcPr>
           <w:p>
             <w:r/>
@@ -1204,7 +918,7 @@
               <w:rPr>
                 <w:sz w:val="20"/>
               </w:rPr>
-              <w:t>4 random mechanics per level (5 from level 12)</w:t>
+              <w:t>4 random obstacles per level (5 from level 12)</w:t>
             </w:r>
           </w:p>
         </w:tc>
@@ -1216,37 +930,7 @@
         <w:pStyle w:val="Heading1"/>
       </w:pPr>
       <w:r>
-        <w:t>GitHub Repository</w:t>
-      </w:r>
-    </w:p>
-    <w:p>
-      <w:r>
-        <w:rPr>
-          <w:b/>
-        </w:rPr>
-        <w:t xml:space="preserve">Repository: </w:t>
-      </w:r>
-      <w:r>
-        <w:t>https://github.com/CSCI-526/Team7-trust-no-walls</w:t>
-      </w:r>
-    </w:p>
-    <w:p>
-      <w:r>
-        <w:rPr>
-          <w:b/>
-        </w:rPr>
-        <w:t xml:space="preserve">Playable build (GitHub Pages): </w:t>
-      </w:r>
-      <w:r>
-        <w:t>https://csci-526.github.io/Team7-trust-no-walls/</w:t>
-      </w:r>
-    </w:p>
-    <w:p>
-      <w:pPr>
-        <w:pStyle w:val="Heading1"/>
-      </w:pPr>
-      <w:r>
-        <w:t>Individual Contributions</w:t>
+        <w:t>Individual contributions</w:t>
       </w:r>
     </w:p>
     <w:p>
@@ -1257,10 +941,10 @@
         <w:rPr>
           <w:b/>
         </w:rPr>
-        <w:t xml:space="preserve">Qiming Xiao: </w:t>
+        <w:t>Qiming Xiao:</w:t>
       </w:r>
       <w:r>
-        <w:t>Game concept and design direction (maze + deceptive-maze twist), genre research on Pac-Man, Maze Craze and Level Devil, design of the obstacle set and level progression (which mechanic unlocks when), playtesting and difficulty feedback, the descriptive document, and the gameplay video.</w:t>
+        <w:t xml:space="preserve"> Game concept and design direction (maze + deceptive-maze twist), genre research on Pac-Man, Maze Craze and Level Devil, design of the obstacle set and level progression, playtesting and difficulty feedback, the descriptive document, and the gameplay video.</w:t>
       </w:r>
     </w:p>
     <w:p>
@@ -1271,10 +955,10 @@
         <w:rPr>
           <w:b/>
         </w:rPr>
-        <w:t xml:space="preserve">Manas Vardhan: </w:t>
+        <w:t>Manas Vardhan:</w:t>
       </w:r>
       <w:r>
-        <w:t>Unity implementation: procedural maze generation and the solvability validator, the level simulation for all obstacles, rendering, animations, HUD, audio and game flow, the demo autopilot and automated tests, and the WebGL build hosted on GitHub Pages.</w:t>
+        <w:t xml:space="preserve"> Unity implementation: procedural maze generation and the solvability validator, the level simulation for all obstacles, rendering, animations, HUD, audio and game flow, the demo autopilot and automated tests, and the WebGL build hosted on GitHub Pages.</w:t>
       </w:r>
     </w:p>
     <w:p>
@@ -1282,7 +966,7 @@
         <w:pStyle w:val="Heading1"/>
       </w:pPr>
       <w:r>
-        <w:t>Sketches and Diagrams</w:t>
+        <w:t>Diagrams</w:t>
       </w:r>
     </w:p>
     <w:p>
@@ -1290,10 +974,7 @@
         <w:rPr>
           <w:b/>
         </w:rPr>
-        <w:t xml:space="preserve">Figure 1. </w:t>
-      </w:r>
-      <w:r>
-        <w:t>Game loop: from the title screen through intro cards, play, death (restart the same layout) and level completion (next, larger maze).</w:t>
+        <w:t>Figure 1. Game loop.</w:t>
       </w:r>
     </w:p>
     <w:p>
@@ -1337,10 +1018,10 @@
         <w:rPr>
           <w:b/>
         </w:rPr>
-        <w:t xml:space="preserve">Figure 2. </w:t>
+        <w:t>Figure 2. Level generation.</w:t>
       </w:r>
       <w:r>
-        <w:t>Level generation: a seeded maze is generated, loops are added, mechanics are chosen by level, and every obstacle is placed only if the solvability validator confirms the level stays completable with no traps.</w:t>
+        <w:t xml:space="preserve"> Each obstacle is kept only if the validator confirms the level stays completable with no traps.</w:t>
       </w:r>
     </w:p>
     <w:p>

</xml_diff>

<commit_message>
Make links in the Word document clickable
</commit_message>
<xml_diff>
--- a/design/Trust-No-Wall-Descriptive-Document.docx
+++ b/design/Trust-No-Wall-Descriptive-Document.docx
@@ -12,6 +12,9 @@
     </w:p>
     <w:p>
       <w:r>
+        <w:rPr>
+          <w:b w:val="0"/>
+        </w:rPr>
         <w:t>Team 7: Qiming Xiao, Manas Vardhan</w:t>
       </w:r>
     </w:p>
@@ -26,8 +29,20 @@
         <w:t>Play online:</w:t>
       </w:r>
       <w:r>
-        <w:t xml:space="preserve"> https://csci-526.github.io/Team7-trust-no-walls/</w:t>
+        <w:rPr>
+          <w:b w:val="0"/>
+        </w:rPr>
+        <w:t xml:space="preserve"> </w:t>
       </w:r>
+      <w:hyperlink r:id="rId9">
+        <w:r>
+          <w:rPr>
+            <w:color w:val="1155CC"/>
+            <w:u w:val="single"/>
+          </w:rPr>
+          <w:t xml:space="preserve">https://csci-526.github.io/Team7-trust-no-walls/</w:t>
+        </w:r>
+      </w:hyperlink>
     </w:p>
     <w:p>
       <w:pPr>
@@ -40,8 +55,20 @@
         <w:t>Gameplay video:</w:t>
       </w:r>
       <w:r>
-        <w:t xml:space="preserve"> https://drive.google.com/file/d/108_E55riLKDuFTiWyroH48iHKu0jDZD_/view?usp=sharing</w:t>
+        <w:rPr>
+          <w:b w:val="0"/>
+        </w:rPr>
+        <w:t xml:space="preserve"> </w:t>
       </w:r>
+      <w:hyperlink r:id="rId10">
+        <w:r>
+          <w:rPr>
+            <w:color w:val="1155CC"/>
+            <w:u w:val="single"/>
+          </w:rPr>
+          <w:t xml:space="preserve">https://drive.google.com/file/d/108_E55riLKDuFTiWyroH48iHKu0jDZD_/view?usp=sharing</w:t>
+        </w:r>
+      </w:hyperlink>
     </w:p>
     <w:p>
       <w:pPr>
@@ -54,8 +81,20 @@
         <w:t>Repository:</w:t>
       </w:r>
       <w:r>
-        <w:t xml:space="preserve"> https://github.com/CSCI-526/Team7-trust-no-walls</w:t>
+        <w:rPr>
+          <w:b w:val="0"/>
+        </w:rPr>
+        <w:t xml:space="preserve"> </w:t>
       </w:r>
+      <w:hyperlink r:id="rId11">
+        <w:r>
+          <w:rPr>
+            <w:color w:val="1155CC"/>
+            <w:u w:val="single"/>
+          </w:rPr>
+          <w:t xml:space="preserve">https://github.com/CSCI-526/Team7-trust-no-walls</w:t>
+        </w:r>
+      </w:hyperlink>
     </w:p>
     <w:p>
       <w:pPr>
@@ -67,6 +106,9 @@
     </w:p>
     <w:p>
       <w:r>
+        <w:rPr>
+          <w:b w:val="0"/>
+        </w:rPr>
         <w:t>A 2D top-down maze game where the maze itself lies to you: walls hide, move, vanish and rewire, but every lie follows a learnable rule (Maze + Deceptive, Changing Maze).</w:t>
       </w:r>
     </w:p>
@@ -97,6 +139,9 @@
         <w:t>Pac-Man</w:t>
       </w:r>
       <w:r>
+        <w:rPr>
+          <w:b w:val="0"/>
+        </w:rPr>
         <w:t xml:space="preserve"> (Namco, 1980). The player navigates a fixed, fully visible maze, collecting pellets while avoiding four ghosts, each with its own movement pattern. The maze never changes; mastery comes from learning the ghosts, not the maze.</w:t>
       </w:r>
     </w:p>
@@ -111,6 +156,9 @@
         <w:t>Maze Craze: A Game of Cops 'n Robbers</w:t>
       </w:r>
       <w:r>
+        <w:rPr>
+          <w:b w:val="0"/>
+        </w:rPr>
         <w:t xml:space="preserve"> (Atari 2600). Two players race through a randomly generated top-down maze. Optional variants add novelty rules, such as a maze that is invisible and only briefly revealed, but these are side modes on an otherwise honest maze.</w:t>
       </w:r>
     </w:p>
@@ -125,6 +173,9 @@
         <w:t>Level Devil</w:t>
       </w:r>
       <w:r>
+        <w:rPr>
+          <w:b w:val="0"/>
+        </w:rPr>
         <w:t xml:space="preserve"> (Unept (Adam Corey), 2023). A trial-and-error game where floors become spikes and platforms vanish when you commit. The level deceives the player, who progresses by dying, memorizing and retrying, with no warning on a first attempt and no guarantee a trap is fair.</w:t>
       </w:r>
     </w:p>
@@ -141,6 +192,9 @@
         <w:pStyle w:val="ListNumber"/>
       </w:pPr>
       <w:r>
+        <w:rPr>
+          <w:b w:val="0"/>
+        </w:rPr>
         <w:t>The maze is a stable, observable puzzle: what you see is the truth, and skill means reading the layout.</w:t>
       </w:r>
     </w:p>
@@ -149,6 +203,9 @@
         <w:pStyle w:val="ListNumber"/>
       </w:pPr>
       <w:r>
+        <w:rPr>
+          <w:b w:val="0"/>
+        </w:rPr>
         <w:t>Hidden or false information, when present, is an optional side mode, not the core of play.</w:t>
       </w:r>
     </w:p>
@@ -157,6 +214,9 @@
         <w:pStyle w:val="ListNumber"/>
       </w:pPr>
       <w:r>
+        <w:rPr>
+          <w:b w:val="0"/>
+        </w:rPr>
         <w:t>When deception is the whole point (Level Devil), there is no fairness guarantee or rule to learn from.</w:t>
       </w:r>
     </w:p>
@@ -165,6 +225,9 @@
         <w:pStyle w:val="ListNumber"/>
       </w:pPr>
       <w:r>
+        <w:rPr>
+          <w:b w:val="0"/>
+        </w:rPr>
         <w:t>Failing restarts the same challenge; only the player's knowledge improves.</w:t>
       </w:r>
     </w:p>
@@ -173,6 +236,9 @@
         <w:pStyle w:val="ListNumber"/>
       </w:pPr>
       <w:r>
+        <w:rPr>
+          <w:b w:val="0"/>
+        </w:rPr>
         <w:t>Simple directional movement, a clear start and goal, and difficulty that rises through bigger layouts and more threats.</w:t>
       </w:r>
     </w:p>
@@ -192,6 +258,9 @@
         <w:t>Twist:</w:t>
       </w:r>
       <w:r>
+        <w:rPr>
+          <w:b w:val="0"/>
+        </w:rPr>
         <w:t xml:space="preserve"> the maze itself is deceptive and changing (invisible walls, sliding and disappearing walls, trigger plates that rewire walls, a decoy goal, a shadow that follows your trail), yet every level is checked to be solvable and every lie follows a fixed, telegraphed rule.</w:t>
       </w:r>
     </w:p>
@@ -203,6 +272,9 @@
         <w:t>Why it is innovative:</w:t>
       </w:r>
       <w:r>
+        <w:rPr>
+          <w:b w:val="0"/>
+        </w:rPr>
         <w:t xml:space="preserve"> it </w:t>
       </w:r>
       <w:r>
@@ -212,6 +284,9 @@
         <w:t>subverts</w:t>
       </w:r>
       <w:r>
+        <w:rPr>
+          <w:b w:val="0"/>
+        </w:rPr>
         <w:t xml:space="preserve"> tropes 1 and 2 by making deception the constant condition of the whole game instead of an optional mode on an honest maze. It </w:t>
       </w:r>
       <w:r>
@@ -221,6 +296,9 @@
         <w:t>combines</w:t>
       </w:r>
       <w:r>
+        <w:rPr>
+          <w:b w:val="0"/>
+        </w:rPr>
         <w:t xml:space="preserve"> Maze Craze's hidden-maze idea with Level Devil's committed deception, but applies it to maze navigation instead of platforming. It fixes trope 3's weakness with a solvability guarantee and visible tells (a wall flashes before it moves, plates share a color with their walls, memory tiles reveal hidden walls, the real goal's star spins while a decoy's does not). It deliberately keeps trope 4: dying restarts the same layout, so remembering the maze's specific lies becomes the skill.</w:t>
       </w:r>
     </w:p>
@@ -234,6 +312,9 @@
     </w:p>
     <w:p>
       <w:r>
+        <w:rPr>
+          <w:b w:val="0"/>
+        </w:rPr>
         <w:t>The player steps through a top-down grid maze from a Start pad to a Destination star, and the maze grows by one cell in each dimension every level (4 x 4 on level 1). As levels progress, new obstacles that deceive or change the maze unlock: invisible walls, sliding and disappearing walls, collapsing floors, trigger plates that rewire walls, teleporters, rotating gates, patrols, one-way paths, a decoy goal and a shadow that follows the player's trail. Because each obstacle follows a fixed rule and dying restarts the same layout, the player must observe, time and remember the maze's tricks instead of simply reading its map.</w:t>
       </w:r>
     </w:p>
@@ -245,6 +326,9 @@
         <w:t>Controls:</w:t>
       </w:r>
       <w:r>
+        <w:rPr>
+          <w:b w:val="0"/>
+        </w:rPr>
         <w:t xml:space="preserve"> WASD or Arrow keys move one cell per step (hold to keep moving); Space or Enter starts and skips intro cards; R restarts the attempt; P or Esc pauses; M mutes; F2 toggles a demo autopilot.</w:t>
       </w:r>
     </w:p>
@@ -378,6 +462,7 @@
             <w:r/>
             <w:r>
               <w:rPr>
+                <w:b w:val="0"/>
                 <w:sz w:val="18"/>
               </w:rPr>
               <w:t>Deceptive, Changing Maze (core mechanic)</w:t>
@@ -392,6 +477,7 @@
             <w:r/>
             <w:r>
               <w:rPr>
+                <w:b w:val="0"/>
                 <w:sz w:val="18"/>
               </w:rPr>
               <w:t>The maze's walls and floor hide, move, vanish and rewire according to fixed, telegraphed rules while the player navigates from Start to Destination.</w:t>
@@ -406,6 +492,7 @@
             <w:r/>
             <w:r>
               <w:rPr>
+                <w:b w:val="0"/>
                 <w:sz w:val="18"/>
               </w:rPr>
               <w:t>It is the twist: the player cannot trust the visible map and must learn each rule, and dying restarts the same layout so every lie can be learned.</w:t>
@@ -420,6 +507,7 @@
             <w:r/>
             <w:r>
               <w:rPr>
+                <w:b w:val="0"/>
                 <w:sz w:val="18"/>
               </w:rPr>
               <w:t>Maze layout, walls, navigation, the goal, the retry loop</w:t>
@@ -434,6 +522,7 @@
             <w:r/>
             <w:r>
               <w:rPr>
+                <w:b w:val="0"/>
                 <w:sz w:val="18"/>
               </w:rPr>
               <w:t>Subversion, Combination</w:t>
@@ -448,6 +537,7 @@
             <w:r/>
             <w:r>
               <w:rPr>
+                <w:b w:val="0"/>
                 <w:sz w:val="18"/>
               </w:rPr>
               <w:t>Exploration, timing, memory</w:t>
@@ -536,6 +626,7 @@
             <w:r/>
             <w:r>
               <w:rPr>
+                <w:b w:val="0"/>
                 <w:sz w:val="20"/>
               </w:rPr>
               <w:t>1</w:t>
@@ -550,6 +641,7 @@
             <w:r/>
             <w:r>
               <w:rPr>
+                <w:b w:val="0"/>
                 <w:sz w:val="20"/>
               </w:rPr>
               <w:t>4 x 4</w:t>
@@ -564,6 +656,7 @@
             <w:r/>
             <w:r>
               <w:rPr>
+                <w:b w:val="0"/>
                 <w:sz w:val="20"/>
               </w:rPr>
               <w:t>None: basic maze</w:t>
@@ -580,6 +673,7 @@
             <w:r/>
             <w:r>
               <w:rPr>
+                <w:b w:val="0"/>
                 <w:sz w:val="20"/>
               </w:rPr>
               <w:t>2</w:t>
@@ -594,6 +688,7 @@
             <w:r/>
             <w:r>
               <w:rPr>
+                <w:b w:val="0"/>
                 <w:sz w:val="20"/>
               </w:rPr>
               <w:t>5 x 5</w:t>
@@ -608,6 +703,7 @@
             <w:r/>
             <w:r>
               <w:rPr>
+                <w:b w:val="0"/>
                 <w:sz w:val="20"/>
               </w:rPr>
               <w:t>Invisible Walls, Memory Tiles</w:t>
@@ -624,6 +720,7 @@
             <w:r/>
             <w:r>
               <w:rPr>
+                <w:b w:val="0"/>
                 <w:sz w:val="20"/>
               </w:rPr>
               <w:t>3</w:t>
@@ -638,6 +735,7 @@
             <w:r/>
             <w:r>
               <w:rPr>
+                <w:b w:val="0"/>
                 <w:sz w:val="20"/>
               </w:rPr>
               <w:t>6 x 6</w:t>
@@ -652,6 +750,7 @@
             <w:r/>
             <w:r>
               <w:rPr>
+                <w:b w:val="0"/>
                 <w:sz w:val="20"/>
               </w:rPr>
               <w:t>Moving Walls, Disappearing Walls</w:t>
@@ -668,6 +767,7 @@
             <w:r/>
             <w:r>
               <w:rPr>
+                <w:b w:val="0"/>
                 <w:sz w:val="20"/>
               </w:rPr>
               <w:t>4</w:t>
@@ -682,6 +782,7 @@
             <w:r/>
             <w:r>
               <w:rPr>
+                <w:b w:val="0"/>
                 <w:sz w:val="20"/>
               </w:rPr>
               <w:t>7 x 7</w:t>
@@ -696,6 +797,7 @@
             <w:r/>
             <w:r>
               <w:rPr>
+                <w:b w:val="0"/>
                 <w:sz w:val="20"/>
               </w:rPr>
               <w:t>Collapsing Tiles, Trigger Walls (+ one earlier obstacle)</w:t>
@@ -712,6 +814,7 @@
             <w:r/>
             <w:r>
               <w:rPr>
+                <w:b w:val="0"/>
                 <w:sz w:val="20"/>
               </w:rPr>
               <w:t>5</w:t>
@@ -726,6 +829,7 @@
             <w:r/>
             <w:r>
               <w:rPr>
+                <w:b w:val="0"/>
                 <w:sz w:val="20"/>
               </w:rPr>
               <w:t>8 x 8</w:t>
@@ -740,6 +844,7 @@
             <w:r/>
             <w:r>
               <w:rPr>
+                <w:b w:val="0"/>
                 <w:sz w:val="20"/>
               </w:rPr>
               <w:t>Teleporters, Rotating Gates (+ one earlier obstacle)</w:t>
@@ -756,6 +861,7 @@
             <w:r/>
             <w:r>
               <w:rPr>
+                <w:b w:val="0"/>
                 <w:sz w:val="20"/>
               </w:rPr>
               <w:t>6</w:t>
@@ -770,6 +876,7 @@
             <w:r/>
             <w:r>
               <w:rPr>
+                <w:b w:val="0"/>
                 <w:sz w:val="20"/>
               </w:rPr>
               <w:t>9 x 9</w:t>
@@ -784,6 +891,7 @@
             <w:r/>
             <w:r>
               <w:rPr>
+                <w:b w:val="0"/>
                 <w:sz w:val="20"/>
               </w:rPr>
               <w:t>Patrols, One-Way Paths (+ one earlier obstacle)</w:t>
@@ -800,6 +908,7 @@
             <w:r/>
             <w:r>
               <w:rPr>
+                <w:b w:val="0"/>
                 <w:sz w:val="20"/>
               </w:rPr>
               <w:t>7</w:t>
@@ -814,6 +923,7 @@
             <w:r/>
             <w:r>
               <w:rPr>
+                <w:b w:val="0"/>
                 <w:sz w:val="20"/>
               </w:rPr>
               <w:t>10 x 10</w:t>
@@ -828,6 +938,7 @@
             <w:r/>
             <w:r>
               <w:rPr>
+                <w:b w:val="0"/>
                 <w:sz w:val="20"/>
               </w:rPr>
               <w:t>Decoy Destination (+ one earlier obstacle)</w:t>
@@ -844,6 +955,7 @@
             <w:r/>
             <w:r>
               <w:rPr>
+                <w:b w:val="0"/>
                 <w:sz w:val="20"/>
               </w:rPr>
               <w:t>8</w:t>
@@ -858,6 +970,7 @@
             <w:r/>
             <w:r>
               <w:rPr>
+                <w:b w:val="0"/>
                 <w:sz w:val="20"/>
               </w:rPr>
               <w:t>11 x 11</w:t>
@@ -872,6 +985,7 @@
             <w:r/>
             <w:r>
               <w:rPr>
+                <w:b w:val="0"/>
                 <w:sz w:val="20"/>
               </w:rPr>
               <w:t>Chasing Shadow (+ one earlier obstacle)</w:t>
@@ -888,6 +1002,7 @@
             <w:r/>
             <w:r>
               <w:rPr>
+                <w:b w:val="0"/>
                 <w:sz w:val="20"/>
               </w:rPr>
               <w:t>9+</w:t>
@@ -902,6 +1017,7 @@
             <w:r/>
             <w:r>
               <w:rPr>
+                <w:b w:val="0"/>
                 <w:sz w:val="20"/>
               </w:rPr>
               <w:t>12 x 12 and up</w:t>
@@ -916,6 +1032,7 @@
             <w:r/>
             <w:r>
               <w:rPr>
+                <w:b w:val="0"/>
                 <w:sz w:val="20"/>
               </w:rPr>
               <w:t>4 random obstacles per level (5 from level 12)</w:t>
@@ -944,6 +1061,9 @@
         <w:t>Qiming Xiao:</w:t>
       </w:r>
       <w:r>
+        <w:rPr>
+          <w:b w:val="0"/>
+        </w:rPr>
         <w:t xml:space="preserve"> Game concept and design direction (maze + deceptive-maze twist), genre research on Pac-Man, Maze Craze and Level Devil, design of the obstacle set and level progression, playtesting and difficulty feedback, the descriptive document, and the gameplay video.</w:t>
       </w:r>
     </w:p>
@@ -958,6 +1078,9 @@
         <w:t>Manas Vardhan:</w:t>
       </w:r>
       <w:r>
+        <w:rPr>
+          <w:b w:val="0"/>
+        </w:rPr>
         <w:t xml:space="preserve"> Unity implementation: procedural maze generation and the solvability validator, the level simulation for all obstacles, rendering, animations, HUD, audio and game flow, the demo autopilot and automated tests, and the WebGL build hosted on GitHub Pages.</w:t>
       </w:r>
     </w:p>
@@ -994,7 +1117,7 @@
                     <pic:cNvPicPr/>
                   </pic:nvPicPr>
                   <pic:blipFill>
-                    <a:blip r:embed="rId9"/>
+                    <a:blip r:embed="rId12"/>
                     <a:stretch>
                       <a:fillRect/>
                     </a:stretch>
@@ -1021,6 +1144,9 @@
         <w:t>Figure 2. Level generation.</w:t>
       </w:r>
       <w:r>
+        <w:rPr>
+          <w:b w:val="0"/>
+        </w:rPr>
         <w:t xml:space="preserve"> Each obstacle is kept only if the validator confirms the level stays completable with no traps.</w:t>
       </w:r>
     </w:p>
@@ -1041,7 +1167,7 @@
                     <pic:cNvPicPr/>
                   </pic:nvPicPr>
                   <pic:blipFill>
-                    <a:blip r:embed="rId10"/>
+                    <a:blip r:embed="rId13"/>
                     <a:stretch>
                       <a:fillRect/>
                     </a:stretch>

</xml_diff>